<commit_message>
cj dalsi knihy a prace napsana v1
</commit_message>
<xml_diff>
--- a/cj_maturita.docx
+++ b/cj_maturita.docx
@@ -29,9 +29,8 @@
           <w:sz w:val="32"/>
           <w:szCs w:val="32"/>
         </w:rPr>
-        <w:t xml:space="preserve"> - </w:t>
-      </w:r>
-      <w:proofErr w:type="spellStart"/>
+        <w:t xml:space="preserve"> </w:t>
+      </w:r>
       <w:r>
         <w:rPr>
           <w:b/>
@@ -39,7 +38,7 @@
           <w:sz w:val="32"/>
           <w:szCs w:val="32"/>
         </w:rPr>
-        <w:t>Mol</w:t>
+        <w:t>–</w:t>
       </w:r>
       <w:r>
         <w:rPr>
@@ -48,8 +47,9 @@
           <w:sz w:val="32"/>
           <w:szCs w:val="32"/>
         </w:rPr>
-        <w:t>i</w:t>
-      </w:r>
+        <w:t xml:space="preserve"> </w:t>
+      </w:r>
+      <w:proofErr w:type="spellStart"/>
       <w:r>
         <w:rPr>
           <w:b/>
@@ -57,9 +57,56 @@
           <w:sz w:val="32"/>
           <w:szCs w:val="32"/>
         </w:rPr>
+        <w:t>Mol</w:t>
+      </w:r>
+      <w:r>
+        <w:rPr>
+          <w:b/>
+          <w:bCs/>
+          <w:sz w:val="32"/>
+          <w:szCs w:val="32"/>
+        </w:rPr>
+        <w:t>i</w:t>
+      </w:r>
+      <w:r>
+        <w:rPr>
+          <w:b/>
+          <w:bCs/>
+          <w:sz w:val="32"/>
+          <w:szCs w:val="32"/>
+        </w:rPr>
         <w:t>ére</w:t>
       </w:r>
       <w:proofErr w:type="spellEnd"/>
+      <w:r>
+        <w:rPr>
+          <w:b/>
+          <w:bCs/>
+          <w:sz w:val="32"/>
+          <w:szCs w:val="32"/>
+        </w:rPr>
+        <w:t xml:space="preserve"> (</w:t>
+      </w:r>
+      <w:proofErr w:type="spellStart"/>
+      <w:r>
+        <w:rPr>
+          <w:b/>
+          <w:bCs/>
+          <w:sz w:val="32"/>
+          <w:szCs w:val="32"/>
+        </w:rPr>
+        <w:t>Moliér</w:t>
+      </w:r>
+      <w:proofErr w:type="spellEnd"/>
+      <w:r>
+        <w:rPr>
+          <w:b/>
+          <w:bCs/>
+          <w:sz w:val="32"/>
+          <w:szCs w:val="32"/>
+        </w:rPr>
+        <w:t>)</w:t>
+      </w:r>
     </w:p>
     <w:p>
       <w:pPr>
@@ -335,11 +382,14 @@
         <w:t>Další autorova díla:</w:t>
       </w:r>
       <w:r>
-        <w:t xml:space="preserve"> Tartuffe, </w:t>
+        <w:t xml:space="preserve"> </w:t>
       </w:r>
       <w:r>
         <w:t>Mastičkář</w:t>
       </w:r>
+      <w:r>
+        <w:t xml:space="preserve"> - </w:t>
+      </w:r>
     </w:p>
     <w:p>
       <w:r>
@@ -363,10 +413,28 @@
         <w:t xml:space="preserve"> </w:t>
       </w:r>
       <w:r>
-        <w:t xml:space="preserve">směr - </w:t>
+        <w:t xml:space="preserve">směr </w:t>
+      </w:r>
+      <w:r>
+        <w:t>–</w:t>
+      </w:r>
+      <w:r>
+        <w:t xml:space="preserve"> </w:t>
       </w:r>
       <w:r>
         <w:t>Klasicismus</w:t>
+      </w:r>
+      <w:r>
+        <w:t xml:space="preserve"> – </w:t>
+      </w:r>
+      <w:r>
+        <w:t>inspiroval</w:t>
+      </w:r>
+      <w:r>
+        <w:t xml:space="preserve"> se</w:t>
+      </w:r>
+      <w:r>
+        <w:t xml:space="preserve"> antickým uměním a kladl důraz na rozum, řád, symetrii a uměřenost</w:t>
       </w:r>
       <w:r>
         <w:t>,  Carlo Goldoni – Sluha dvou pánů</w:t>
@@ -405,6 +473,15 @@
         </w:rPr>
         <w:t xml:space="preserve"> – Wiliam Shakespear</w:t>
       </w:r>
+      <w:r>
+        <w:rPr>
+          <w:b/>
+          <w:bCs/>
+          <w:sz w:val="32"/>
+          <w:szCs w:val="32"/>
+        </w:rPr>
+        <w:t xml:space="preserve"> </w:t>
+      </w:r>
     </w:p>
     <w:p>
       <w:pPr>
@@ -662,13 +739,10 @@
         <w:t xml:space="preserve"> </w:t>
       </w:r>
       <w:r>
-        <w:t xml:space="preserve">Hamlet, </w:t>
-      </w:r>
-      <w:r>
-        <w:t xml:space="preserve"> </w:t>
-      </w:r>
-      <w:r>
-        <w:t>Sen noci svatojánské</w:t>
+        <w:t>Hamlet</w:t>
+      </w:r>
+      <w:r>
+        <w:t xml:space="preserve"> </w:t>
       </w:r>
     </w:p>
     <w:p>
@@ -716,10 +790,22 @@
         <w:t xml:space="preserve"> a humanismus</w:t>
       </w:r>
       <w:r>
+        <w:t xml:space="preserve"> - </w:t>
+      </w:r>
+      <w:r>
+        <w:t>byl myšlenkový směr v rámci renesance, který kladl důraz na člověka, lidský rozum, vzdělání a kritické myšlení</w:t>
+      </w:r>
+      <w:r>
         <w:t xml:space="preserve">; </w:t>
       </w:r>
       <w:r>
-        <w:t xml:space="preserve">Další autoři – Dante Alighiery – Božská komedie, Giovanni Boccacio - Dekameron </w:t>
+        <w:t>Další autoři –</w:t>
+      </w:r>
+      <w:r>
+        <w:t xml:space="preserve"> </w:t>
+      </w:r>
+      <w:r>
+        <w:t xml:space="preserve">Giovanni Boccacio - Dekameron </w:t>
       </w:r>
     </w:p>
     <w:p>
@@ -942,7 +1028,13 @@
         <w:t xml:space="preserve"> – </w:t>
       </w:r>
       <w:r>
-        <w:t>muzikant, jeho basa z vrby vyzradila královo tajemství</w:t>
+        <w:t xml:space="preserve">muzikant, jeho </w:t>
+      </w:r>
+      <w:r>
+        <w:t>píšťala</w:t>
+      </w:r>
+      <w:r>
+        <w:t xml:space="preserve"> z vrby vyzradila královo tajemství</w:t>
       </w:r>
     </w:p>
     <w:p>
@@ -978,7 +1070,7 @@
         <w:t xml:space="preserve"> </w:t>
       </w:r>
       <w:r>
-        <w:t>Tyrolské elegie, Křest svatého Vladimíra</w:t>
+        <w:t>Tyrolské elegie</w:t>
       </w:r>
     </w:p>
     <w:p>
@@ -1012,7 +1104,10 @@
         <w:t xml:space="preserve">., </w:t>
       </w:r>
       <w:r>
-        <w:t>směr -</w:t>
+        <w:t xml:space="preserve">směr </w:t>
+      </w:r>
+      <w:r>
+        <w:t>–</w:t>
       </w:r>
       <w:r>
         <w:rPr>
@@ -1025,6 +1120,12 @@
         <w:t>realismus</w:t>
       </w:r>
       <w:r>
+        <w:t xml:space="preserve"> - </w:t>
+      </w:r>
+      <w:r>
+        <w:t>usiluje o objektivní, pravdivé a všestranné zobrazení skutečnosti bez idealizace</w:t>
+      </w:r>
+      <w:r>
         <w:t xml:space="preserve">; </w:t>
       </w:r>
       <w:r>
@@ -1034,7 +1135,13 @@
         <w:t>B. Němcová</w:t>
       </w:r>
       <w:r>
-        <w:t xml:space="preserve"> - babička, K. H. Mácha – Máj</w:t>
+        <w:t xml:space="preserve"> - </w:t>
+      </w:r>
+      <w:r>
+        <w:t>B</w:t>
+      </w:r>
+      <w:r>
+        <w:t>abička</w:t>
       </w:r>
     </w:p>
     <w:p>
@@ -1283,7 +1390,7 @@
         <w:t xml:space="preserve"> </w:t>
       </w:r>
       <w:r>
-        <w:t>Deník morového roku, Moll Flandersová</w:t>
+        <w:t>Deník morového roku</w:t>
       </w:r>
     </w:p>
     <w:p>
@@ -1336,6 +1443,12 @@
         <w:t>osvícenství</w:t>
       </w:r>
       <w:r>
+        <w:t xml:space="preserve"> - </w:t>
+      </w:r>
+      <w:r>
+        <w:t>důraz na racionalismus, kritické myšlení, vědecký pokrok a lidskou svobodu, zatímco kritizoval absolutismus, církevní dogmata a pověry</w:t>
+      </w:r>
+      <w:r>
         <w:t xml:space="preserve">; </w:t>
       </w:r>
       <w:r>
@@ -1343,12 +1456,6 @@
       </w:r>
       <w:r>
         <w:t xml:space="preserve"> Molérie – Lakomec</w:t>
-      </w:r>
-      <w:r>
-        <w:t xml:space="preserve">, </w:t>
-      </w:r>
-      <w:r>
-        <w:t>Zdravý nemocný</w:t>
       </w:r>
     </w:p>
     <w:p>
@@ -1472,7 +1579,13 @@
         <w:pStyle w:val="Odstavecseseznamem"/>
       </w:pPr>
       <w:r>
-        <w:t>Ser Ciapelleto má ve městě vymáhat dluhy, jenže smrtelně onemocní. Oklame falešnou zpovědí mnicha a zemře, přestože že žil hříšným životem tak je po smrti nazýván svatým Ciapelletem.</w:t>
+        <w:t>S</w:t>
+      </w:r>
+      <w:r>
+        <w:t>i</w:t>
+      </w:r>
+      <w:r>
+        <w:t>r Ciapelleto má ve městě vymáhat dluhy, jenže smrtelně onemocní. Oklame falešnou zpovědí mnicha a zemře, přestože že žil hříšným životem tak je po smrti nazýván svatým Ciapelletem.</w:t>
       </w:r>
     </w:p>
     <w:p>
@@ -1671,7 +1784,7 @@
         <w:t xml:space="preserve"> </w:t>
       </w:r>
       <w:r>
-        <w:t>Život Dantův, Fiesolské nymfy</w:t>
+        <w:t>Život Dantův</w:t>
       </w:r>
     </w:p>
     <w:p>
@@ -2252,7 +2365,10 @@
         <w:t xml:space="preserve"> </w:t>
       </w:r>
       <w:r>
-        <w:t>Hřbitovní kvítí, Písně kosmické</w:t>
+        <w:t>Hřbitovní kvítí</w:t>
+      </w:r>
+      <w:r>
+        <w:t xml:space="preserve"> </w:t>
       </w:r>
     </w:p>
     <w:p>
@@ -2295,10 +2411,7 @@
         <w:t xml:space="preserve">Další autoři – </w:t>
       </w:r>
       <w:r>
-        <w:t xml:space="preserve">B. Němcová – Babička, </w:t>
-      </w:r>
-      <w:r>
-        <w:t>Vítězslav Hálek - Večerní písně</w:t>
+        <w:t>B. Němcová – Babička</w:t>
       </w:r>
     </w:p>
     <w:p>
@@ -2325,6 +2438,15 @@
         <w:lastRenderedPageBreak/>
         <w:t>Na západní frontě klid – Erich Maria Remarque</w:t>
       </w:r>
+      <w:r>
+        <w:rPr>
+          <w:b/>
+          <w:bCs/>
+          <w:sz w:val="32"/>
+          <w:szCs w:val="32"/>
+        </w:rPr>
+        <w:t xml:space="preserve"> </w:t>
+      </w:r>
     </w:p>
     <w:p>
       <w:pPr>
@@ -2603,10 +2725,7 @@
         <w:t xml:space="preserve"> </w:t>
       </w:r>
       <w:r>
-        <w:t>Černý obelisk</w:t>
-      </w:r>
-      <w:r>
-        <w:t>, Tři Kamarádi</w:t>
+        <w:t>Tři Kamarádi</w:t>
       </w:r>
     </w:p>
     <w:p>
@@ -2653,6 +2772,12 @@
       </w:r>
       <w:r>
         <w:t>moderní světová literatura</w:t>
+      </w:r>
+      <w:r>
+        <w:t xml:space="preserve"> - r</w:t>
+      </w:r>
+      <w:r>
+        <w:t>eaguje na hrůzy první světové války, společenské krize a technický pokrok</w:t>
       </w:r>
       <w:r>
         <w:t xml:space="preserve">; </w:t>
@@ -2948,7 +3073,7 @@
         <w:t xml:space="preserve"> </w:t>
       </w:r>
       <w:r>
-        <w:t>R.U.R., Válka s Mloky</w:t>
+        <w:t>Válka s Mloky</w:t>
       </w:r>
     </w:p>
     <w:p>
@@ -2989,6 +3114,12 @@
       </w:r>
       <w:r>
         <w:t>demokratický proud</w:t>
+      </w:r>
+      <w:r>
+        <w:t xml:space="preserve"> - </w:t>
+      </w:r>
+      <w:r>
+        <w:t>skupinu autorů spjatých s hodnotami první republiky, humanismem a pragmatismem</w:t>
       </w:r>
       <w:r>
         <w:t xml:space="preserve">; </w:t>
@@ -3320,9 +3451,6 @@
         <w:t xml:space="preserve"> </w:t>
       </w:r>
       <w:r>
-        <w:t xml:space="preserve">R.U.R., </w:t>
-      </w:r>
-      <w:r>
         <w:t>Bílá Nemoc</w:t>
       </w:r>
     </w:p>
@@ -3671,10 +3799,7 @@
         <w:t>Další autorova díla:</w:t>
       </w:r>
       <w:r>
-        <w:t xml:space="preserve"> </w:t>
-      </w:r>
-      <w:r>
-        <w:t>Proces, Zámek</w:t>
+        <w:t xml:space="preserve"> Zámek</w:t>
       </w:r>
     </w:p>
     <w:p>
@@ -3706,6 +3831,12 @@
       </w:r>
       <w:r>
         <w:t>existencialismus</w:t>
+      </w:r>
+      <w:r>
+        <w:t xml:space="preserve"> - </w:t>
+      </w:r>
+      <w:r>
+        <w:t>klade důraz na lidskou existenci, absolutní svobodu, odpovědnost a hledání smyslu v absurdním světě</w:t>
       </w:r>
       <w:r>
         <w:t xml:space="preserve">, </w:t>
@@ -4144,6 +4275,12 @@
         <w:t>symbolismus</w:t>
       </w:r>
       <w:r>
+        <w:t xml:space="preserve"> - </w:t>
+      </w:r>
+      <w:r>
+        <w:t>Namísto reálného světa se zaměřoval na vyjádření nálad, snů, skrytých významů a emocí prostřednictvím symbolů</w:t>
+      </w:r>
+      <w:r>
         <w:t xml:space="preserve">, </w:t>
       </w:r>
       <w:r>
@@ -4980,13 +5117,8 @@
         <w:t xml:space="preserve"> </w:t>
       </w:r>
       <w:r>
-        <w:t xml:space="preserve">Neviditelný, </w:t>
-      </w:r>
-      <w:proofErr w:type="spellStart"/>
-      <w:r>
-        <w:t>Helimadoe</w:t>
-      </w:r>
-      <w:proofErr w:type="spellEnd"/>
+        <w:t>Neviditelný</w:t>
+      </w:r>
     </w:p>
     <w:p>
       <w:r>
@@ -5071,7 +5203,7 @@
           <w:szCs w:val="32"/>
         </w:rPr>
         <w:lastRenderedPageBreak/>
-        <w:t xml:space="preserve">Malý princ </w:t>
+        <w:t>Stařec a Moře</w:t>
       </w:r>
       <w:r>
         <w:rPr>
@@ -5080,7 +5212,7 @@
           <w:sz w:val="32"/>
           <w:szCs w:val="32"/>
         </w:rPr>
-        <w:t xml:space="preserve">- </w:t>
+        <w:t xml:space="preserve"> </w:t>
       </w:r>
       <w:r>
         <w:rPr>
@@ -5089,407 +5221,319 @@
           <w:sz w:val="32"/>
           <w:szCs w:val="32"/>
         </w:rPr>
-        <w:t>Exupéry Antoine de</w:t>
-      </w:r>
-    </w:p>
-    <w:p>
-      <w:pPr>
-        <w:rPr>
-          <w:b/>
-          <w:bCs/>
-          <w:sz w:val="24"/>
-          <w:szCs w:val="24"/>
-          <w:u w:val="single"/>
-        </w:rPr>
-      </w:pPr>
-      <w:r>
-        <w:rPr>
-          <w:b/>
-          <w:bCs/>
-          <w:sz w:val="24"/>
-          <w:szCs w:val="24"/>
-          <w:u w:val="single"/>
-        </w:rPr>
-        <w:t>1.část</w:t>
-      </w:r>
-    </w:p>
-    <w:p>
-      <w:r>
-        <w:rPr>
-          <w:b/>
-          <w:bCs/>
-        </w:rPr>
-        <w:t xml:space="preserve">Děj: </w:t>
-      </w:r>
-      <w:r>
-        <w:t xml:space="preserve"> </w:t>
-      </w:r>
-      <w:r>
-        <w:t>Pilot havaruje v poušti a setká se s Malým princem, který chce, aby mu nakreslil beránka. Princ mu vypráví, že opustil svou planetu kvůli hádce s květinou a cestoval po různých planetách, kde poznal krále, domýšlivce, pijana, byznysmena, lampáře a zeměpisce. Na Zemi potkal lišku, která ho naučila, co je přátelství. Nakonec ho uštkl had a princ se vrátil ke své květině na planetu.</w:t>
-      </w:r>
-    </w:p>
-    <w:p>
-      <w:r>
-        <w:rPr>
-          <w:b/>
-          <w:bCs/>
-        </w:rPr>
-        <w:t xml:space="preserve">Téma: </w:t>
-      </w:r>
-      <w:r>
-        <w:t>stře</w:t>
-      </w:r>
-      <w:r>
-        <w:t>t</w:t>
-      </w:r>
-      <w:r>
-        <w:t xml:space="preserve"> světa dítěte se světem dospělého</w:t>
-      </w:r>
-    </w:p>
-    <w:p>
-      <w:r>
-        <w:rPr>
-          <w:b/>
-          <w:bCs/>
-        </w:rPr>
-        <w:t>Motivy</w:t>
-      </w:r>
-      <w:r>
-        <w:t xml:space="preserve">: </w:t>
-      </w:r>
-      <w:r>
-        <w:t xml:space="preserve"> </w:t>
-      </w:r>
-      <w:r>
-        <w:t>hav</w:t>
-      </w:r>
-      <w:r>
-        <w:t>á</w:t>
-      </w:r>
-      <w:r>
-        <w:t>rie, studánka, beránek, smrt, láska</w:t>
-      </w:r>
-    </w:p>
-    <w:p>
-      <w:r>
-        <w:rPr>
-          <w:b/>
-          <w:bCs/>
-        </w:rPr>
-        <w:t>Časoprostor</w:t>
-      </w:r>
-      <w:r>
-        <w:rPr>
-          <w:b/>
-          <w:bCs/>
-        </w:rPr>
-        <w:t xml:space="preserve">: </w:t>
-      </w:r>
-      <w:r>
-        <w:t>není určen</w:t>
-      </w:r>
-      <w:r>
-        <w:t>,</w:t>
-      </w:r>
-      <w:r>
-        <w:t xml:space="preserve"> </w:t>
-      </w:r>
-      <w:r>
-        <w:t>S</w:t>
-      </w:r>
-      <w:r>
-        <w:t>ahara, Země</w:t>
-      </w:r>
-      <w:r>
-        <w:t>,</w:t>
-      </w:r>
-      <w:r>
-        <w:t xml:space="preserve"> </w:t>
-      </w:r>
-      <w:r>
-        <w:t>planety</w:t>
-      </w:r>
-    </w:p>
-    <w:p>
-      <w:r>
-        <w:rPr>
-          <w:b/>
-          <w:bCs/>
-        </w:rPr>
-        <w:t>Kompozice</w:t>
-      </w:r>
-      <w:r>
-        <w:t xml:space="preserve">: </w:t>
-      </w:r>
-      <w:r>
-        <w:t>chronologick</w:t>
-      </w:r>
-      <w:r>
-        <w:t>y</w:t>
-      </w:r>
-      <w:r>
-        <w:rPr>
-          <w:rFonts w:ascii="Noto Sans" w:hAnsi="Noto Sans" w:cs="Noto Sans"/>
-        </w:rPr>
-        <w:t xml:space="preserve"> </w:t>
-      </w:r>
-      <w:r>
-        <w:rPr>
-          <w:rFonts w:ascii="Noto Sans" w:hAnsi="Noto Sans" w:cs="Noto Sans"/>
-        </w:rPr>
-        <w:t>(</w:t>
-      </w:r>
-      <w:r>
-        <w:t>kapitoly, kresby</w:t>
-      </w:r>
-      <w:r>
-        <w:t>)</w:t>
-      </w:r>
-    </w:p>
-    <w:p>
-      <w:r>
-        <w:rPr>
-          <w:b/>
-          <w:bCs/>
-        </w:rPr>
-        <w:t>Lit. Druh a žánr</w:t>
-      </w:r>
-      <w:r>
-        <w:t xml:space="preserve">: </w:t>
-      </w:r>
-      <w:r>
-        <w:t>epika a f</w:t>
-      </w:r>
-      <w:r>
-        <w:t>i</w:t>
-      </w:r>
-      <w:r>
-        <w:t>lozofická pohádka</w:t>
-      </w:r>
-    </w:p>
-    <w:p>
-      <w:pPr>
-        <w:rPr>
-          <w:b/>
-          <w:bCs/>
-          <w:sz w:val="24"/>
-          <w:szCs w:val="24"/>
-          <w:u w:val="single"/>
-        </w:rPr>
-      </w:pPr>
-      <w:r>
-        <w:rPr>
-          <w:b/>
-          <w:bCs/>
-          <w:sz w:val="24"/>
-          <w:szCs w:val="24"/>
-          <w:u w:val="single"/>
-        </w:rPr>
-        <w:t xml:space="preserve">2. část </w:t>
-      </w:r>
-    </w:p>
-    <w:p>
-      <w:r>
-        <w:rPr>
-          <w:b/>
-          <w:bCs/>
-        </w:rPr>
-        <w:t>Postavy</w:t>
-      </w:r>
-      <w:r>
-        <w:rPr>
-          <w:b/>
-          <w:bCs/>
-        </w:rPr>
-        <w:t xml:space="preserve">: </w:t>
-      </w:r>
-      <w:r>
-        <w:rPr>
-          <w:b/>
-          <w:bCs/>
-        </w:rPr>
-        <w:t>Malý princ</w:t>
-      </w:r>
-      <w:r>
-        <w:t xml:space="preserve"> – citlivý, zvědavý, upřímný, dětinsky moudrý</w:t>
-      </w:r>
-      <w:r>
-        <w:rPr>
-          <w:b/>
-          <w:bCs/>
-        </w:rPr>
-        <w:br/>
-      </w:r>
-      <w:r>
-        <w:rPr>
-          <w:b/>
-          <w:bCs/>
-        </w:rPr>
-        <w:t xml:space="preserve">                    </w:t>
-      </w:r>
-      <w:r>
-        <w:rPr>
-          <w:b/>
-          <w:bCs/>
-        </w:rPr>
-        <w:t xml:space="preserve">Pilot – </w:t>
-      </w:r>
-      <w:r>
-        <w:t>rozumný, citlivý, chápavý, ztratil dětskou fantazii</w:t>
-      </w:r>
-      <w:r>
-        <w:rPr>
-          <w:b/>
-          <w:bCs/>
-        </w:rPr>
-        <w:br/>
-      </w:r>
-      <w:r>
-        <w:rPr>
-          <w:b/>
-          <w:bCs/>
-        </w:rPr>
-        <w:t xml:space="preserve">                    </w:t>
-      </w:r>
-      <w:r>
-        <w:rPr>
-          <w:b/>
-          <w:bCs/>
-        </w:rPr>
-        <w:t xml:space="preserve">Růže – </w:t>
-      </w:r>
-      <w:r>
-        <w:t>pyšná, marnivá, ale milující</w:t>
-      </w:r>
-      <w:r>
-        <w:rPr>
-          <w:b/>
-          <w:bCs/>
-        </w:rPr>
-        <w:br/>
-      </w:r>
-      <w:r>
-        <w:rPr>
-          <w:b/>
-          <w:bCs/>
-        </w:rPr>
-        <w:t xml:space="preserve">                    </w:t>
-      </w:r>
-      <w:r>
-        <w:rPr>
-          <w:b/>
-          <w:bCs/>
-        </w:rPr>
-        <w:t xml:space="preserve">Liška – </w:t>
-      </w:r>
-      <w:r>
-        <w:t>moudrá, klidná, přátelská</w:t>
-      </w:r>
-      <w:r>
-        <w:rPr>
-          <w:b/>
-          <w:bCs/>
-        </w:rPr>
-        <w:br/>
-      </w:r>
-      <w:r>
-        <w:rPr>
-          <w:b/>
-          <w:bCs/>
-        </w:rPr>
-        <w:t xml:space="preserve">                    </w:t>
-      </w:r>
-      <w:r>
-        <w:rPr>
-          <w:b/>
-          <w:bCs/>
-        </w:rPr>
-        <w:t xml:space="preserve">Had – </w:t>
-      </w:r>
-      <w:r>
-        <w:t>tajemný, nebezpečný, symbol smrti</w:t>
-      </w:r>
-    </w:p>
-    <w:p>
-      <w:pPr>
-        <w:rPr>
-          <w:b/>
-          <w:bCs/>
-          <w:sz w:val="24"/>
-          <w:szCs w:val="24"/>
-          <w:u w:val="single"/>
-        </w:rPr>
-      </w:pPr>
-      <w:r>
-        <w:rPr>
-          <w:b/>
-          <w:bCs/>
-          <w:sz w:val="24"/>
-          <w:szCs w:val="24"/>
-          <w:u w:val="single"/>
-        </w:rPr>
-        <w:t>3.část</w:t>
-      </w:r>
-    </w:p>
-    <w:p>
-      <w:r>
-        <w:rPr>
-          <w:b/>
-          <w:bCs/>
-        </w:rPr>
-        <w:t>Další autorova díla:</w:t>
-      </w:r>
-      <w:r>
-        <w:t xml:space="preserve"> </w:t>
-      </w:r>
-      <w:r>
-        <w:t>Noční let, Země lidí</w:t>
-      </w:r>
-    </w:p>
-    <w:p>
-      <w:r>
-        <w:rPr>
-          <w:b/>
-          <w:bCs/>
-        </w:rPr>
-        <w:t>Literárně/kulturní kontext:</w:t>
-      </w:r>
-      <w:r>
-        <w:t xml:space="preserve"> </w:t>
-      </w:r>
-      <w:r>
-        <w:t>1. polovina 20. století,</w:t>
-      </w:r>
-      <w:r>
-        <w:t xml:space="preserve"> </w:t>
-      </w:r>
-      <w:r>
-        <w:t>humanismus</w:t>
-      </w:r>
-      <w:r>
-        <w:t xml:space="preserve">, </w:t>
-      </w:r>
-      <w:r>
-        <w:t xml:space="preserve">Další autoři – Albert </w:t>
-      </w:r>
-      <w:proofErr w:type="spellStart"/>
-      <w:r>
-        <w:t>Camus</w:t>
-      </w:r>
-      <w:proofErr w:type="spellEnd"/>
-      <w:r>
-        <w:t xml:space="preserve"> – Cizinec</w:t>
-      </w:r>
-    </w:p>
-    <w:p>
-      <w:pPr>
+        <w:t xml:space="preserve">- </w:t>
+      </w:r>
+      <w:r>
         <w:rPr>
           <w:b/>
           <w:bCs/>
           <w:sz w:val="32"/>
           <w:szCs w:val="32"/>
         </w:rPr>
-      </w:pPr>
+        <w:t>Ernest Hemingway</w:t>
+      </w:r>
+    </w:p>
+    <w:p>
+      <w:pPr>
+        <w:rPr>
+          <w:b/>
+          <w:bCs/>
+          <w:sz w:val="24"/>
+          <w:szCs w:val="24"/>
+          <w:u w:val="single"/>
+        </w:rPr>
+      </w:pPr>
+      <w:r>
+        <w:rPr>
+          <w:b/>
+          <w:bCs/>
+          <w:sz w:val="24"/>
+          <w:szCs w:val="24"/>
+          <w:u w:val="single"/>
+        </w:rPr>
+        <w:t>1.část</w:t>
+      </w:r>
+    </w:p>
+    <w:p>
+      <w:pPr>
+        <w:pStyle w:val="Bezmezer"/>
+      </w:pPr>
+      <w:r>
+        <w:rPr>
+          <w:b/>
+          <w:bCs/>
+        </w:rPr>
+        <w:t xml:space="preserve">Děj: </w:t>
+      </w:r>
+      <w:r>
+        <w:t xml:space="preserve"> </w:t>
+      </w:r>
+      <w:r>
+        <w:t>Kubánský rybář jménem Santiago, který se po dlouhé době neúspěšného lovu</w:t>
+      </w:r>
+    </w:p>
+    <w:p>
+      <w:pPr>
+        <w:pStyle w:val="Bezmezer"/>
+      </w:pPr>
+      <w:r>
+        <w:t>vydává sám na moře, aby zlomil smůlu. Na širém moři chytí obrovskou rybu, se kterou</w:t>
+      </w:r>
+    </w:p>
+    <w:p>
+      <w:pPr>
+        <w:pStyle w:val="Bezmezer"/>
+      </w:pPr>
+      <w:r>
+        <w:t>několik dní bojuje. Jeho vytrvalost, zkušenosti a respekt k přírodě mu pomohou rybu</w:t>
+      </w:r>
+    </w:p>
+    <w:p>
+      <w:pPr>
+        <w:pStyle w:val="Bezmezer"/>
+      </w:pPr>
+      <w:r>
+        <w:t>nakonec porazit, ale cestou zpět ji napadnou žraloci, kteří z ní postupně sežerou maso.</w:t>
+      </w:r>
+    </w:p>
+    <w:p>
+      <w:r>
+        <w:t>Santiago se vrací vyčerpaný a jen s kostrou ryby.</w:t>
+      </w:r>
+    </w:p>
+    <w:p>
+      <w:r>
+        <w:rPr>
+          <w:b/>
+          <w:bCs/>
+        </w:rPr>
+        <w:t xml:space="preserve">Téma: </w:t>
+      </w:r>
+      <w:r>
+        <w:t>lidská vytrvalost a nezlomnost</w:t>
+      </w:r>
+    </w:p>
+    <w:p>
+      <w:r>
+        <w:rPr>
+          <w:b/>
+          <w:bCs/>
+        </w:rPr>
+        <w:t>Motivy</w:t>
+      </w:r>
+      <w:r>
+        <w:t xml:space="preserve">: </w:t>
+      </w:r>
+      <w:r>
+        <w:t xml:space="preserve"> </w:t>
+      </w:r>
+      <w:r>
+        <w:t>moře, ryba, žraloci, samota, boj</w:t>
+      </w:r>
+    </w:p>
+    <w:p>
+      <w:r>
+        <w:rPr>
+          <w:b/>
+          <w:bCs/>
+        </w:rPr>
+        <w:t>Časoprostor</w:t>
+      </w:r>
+      <w:r>
+        <w:rPr>
+          <w:b/>
+          <w:bCs/>
+        </w:rPr>
+        <w:t xml:space="preserve">: </w:t>
+      </w:r>
+      <w:r>
+        <w:t>kubánská vesnice poblíž Havany a moře, září během 3 dnů, polovina 20.</w:t>
+      </w:r>
+      <w:r>
+        <w:t xml:space="preserve"> </w:t>
+      </w:r>
+      <w:r>
+        <w:t>století</w:t>
+      </w:r>
+    </w:p>
+    <w:p>
+      <w:r>
+        <w:rPr>
+          <w:b/>
+          <w:bCs/>
+        </w:rPr>
+        <w:t>Kompozice</w:t>
+      </w:r>
+      <w:r>
+        <w:t xml:space="preserve">: </w:t>
+      </w:r>
+      <w:r>
+        <w:t>chronologick</w:t>
+      </w:r>
+      <w:r>
+        <w:t>y</w:t>
+      </w:r>
+      <w:r>
+        <w:rPr>
+          <w:rFonts w:ascii="Noto Sans" w:hAnsi="Noto Sans" w:cs="Noto Sans"/>
+        </w:rPr>
+        <w:t xml:space="preserve"> </w:t>
+      </w:r>
+      <w:r>
+        <w:rPr>
+          <w:rFonts w:ascii="Noto Sans" w:hAnsi="Noto Sans" w:cs="Noto Sans"/>
+        </w:rPr>
+        <w:t>(</w:t>
+      </w:r>
+      <w:r>
+        <w:t>er forma</w:t>
+      </w:r>
+      <w:r>
+        <w:t>)</w:t>
+      </w:r>
+    </w:p>
+    <w:p>
+      <w:r>
+        <w:rPr>
+          <w:b/>
+          <w:bCs/>
+        </w:rPr>
+        <w:t>Lit. Druh a žánr</w:t>
+      </w:r>
+      <w:r>
+        <w:t xml:space="preserve">: </w:t>
+      </w:r>
+      <w:r>
+        <w:t xml:space="preserve">epika, novela </w:t>
+      </w:r>
+    </w:p>
+    <w:p>
+      <w:pPr>
+        <w:rPr>
+          <w:b/>
+          <w:bCs/>
+          <w:sz w:val="24"/>
+          <w:szCs w:val="24"/>
+          <w:u w:val="single"/>
+        </w:rPr>
+      </w:pPr>
+      <w:r>
+        <w:rPr>
+          <w:b/>
+          <w:bCs/>
+          <w:sz w:val="24"/>
+          <w:szCs w:val="24"/>
+          <w:u w:val="single"/>
+        </w:rPr>
+        <w:t xml:space="preserve">2. část </w:t>
+      </w:r>
+    </w:p>
+    <w:p>
+      <w:r>
+        <w:rPr>
+          <w:b/>
+          <w:bCs/>
+        </w:rPr>
+        <w:t>Postavy</w:t>
+      </w:r>
+      <w:r>
+        <w:rPr>
+          <w:b/>
+          <w:bCs/>
+        </w:rPr>
+        <w:t xml:space="preserve">: </w:t>
+      </w:r>
+      <w:r>
+        <w:rPr>
+          <w:b/>
+          <w:bCs/>
+        </w:rPr>
+        <w:t xml:space="preserve"> </w:t>
+      </w:r>
+      <w:proofErr w:type="spellStart"/>
+      <w:r>
+        <w:rPr>
+          <w:b/>
+          <w:bCs/>
+        </w:rPr>
+        <w:t>Manolin</w:t>
+      </w:r>
+      <w:proofErr w:type="spellEnd"/>
+      <w:r>
+        <w:rPr>
+          <w:b/>
+          <w:bCs/>
+        </w:rPr>
+        <w:t xml:space="preserve"> – </w:t>
+      </w:r>
+      <w:r>
+        <w:t>-Ochotný, uctivý chlapec, pomocník Santiaga (lovil s ním od svých pěti let)</w:t>
+      </w:r>
+      <w:r>
+        <w:rPr>
+          <w:b/>
+          <w:bCs/>
+        </w:rPr>
+        <w:br/>
+      </w:r>
+      <w:r>
+        <w:rPr>
+          <w:b/>
+          <w:bCs/>
+        </w:rPr>
+        <w:t xml:space="preserve">                    </w:t>
+      </w:r>
+    </w:p>
+    <w:p>
+      <w:pPr>
+        <w:rPr>
+          <w:b/>
+          <w:bCs/>
+          <w:sz w:val="24"/>
+          <w:szCs w:val="24"/>
+          <w:u w:val="single"/>
+        </w:rPr>
+      </w:pPr>
+      <w:r>
+        <w:rPr>
+          <w:b/>
+          <w:bCs/>
+          <w:sz w:val="24"/>
+          <w:szCs w:val="24"/>
+          <w:u w:val="single"/>
+        </w:rPr>
+        <w:t>3.část</w:t>
+      </w:r>
+    </w:p>
+    <w:p>
+      <w:r>
+        <w:rPr>
+          <w:b/>
+          <w:bCs/>
+        </w:rPr>
+        <w:t>Další autorova díla:</w:t>
+      </w:r>
+      <w:r>
+        <w:t xml:space="preserve"> </w:t>
+      </w:r>
+      <w:r>
+        <w:t>Komu zvoní hrana</w:t>
+      </w:r>
+    </w:p>
+    <w:p>
+      <w:r>
+        <w:rPr>
+          <w:b/>
+          <w:bCs/>
+        </w:rPr>
+        <w:t>Literárně/kulturní kontext:</w:t>
+      </w:r>
+      <w:r>
+        <w:t xml:space="preserve"> </w:t>
+      </w:r>
+      <w:r>
+        <w:t>1. polovina 20. století, ztracená generace, moderní světová literatura, další autoři – Erich Maria Remarque</w:t>
+      </w:r>
     </w:p>
     <w:p>
       <w:pPr>
@@ -5500,32 +5544,42 @@
           <w:szCs w:val="32"/>
         </w:rPr>
       </w:pPr>
-      <w:r>
+    </w:p>
+    <w:p>
+      <w:pPr>
         <w:rPr>
           <w:b/>
           <w:bCs/>
           <w:sz w:val="32"/>
           <w:szCs w:val="32"/>
         </w:rPr>
-        <w:br w:type="page"/>
-      </w:r>
-    </w:p>
-    <w:p>
-      <w:pPr>
+      </w:pPr>
+      <w:r>
         <w:rPr>
           <w:b/>
           <w:bCs/>
           <w:sz w:val="32"/>
           <w:szCs w:val="32"/>
         </w:rPr>
-      </w:pPr>
-      <w:r>
+        <w:br w:type="page"/>
+      </w:r>
+    </w:p>
+    <w:p>
+      <w:pPr>
         <w:rPr>
           <w:b/>
           <w:bCs/>
           <w:sz w:val="32"/>
           <w:szCs w:val="32"/>
         </w:rPr>
+      </w:pPr>
+      <w:r>
+        <w:rPr>
+          <w:b/>
+          <w:bCs/>
+          <w:sz w:val="32"/>
+          <w:szCs w:val="32"/>
+        </w:rPr>
         <w:lastRenderedPageBreak/>
         <w:t>Kytice</w:t>
       </w:r>
@@ -5765,10 +5819,7 @@
         <w:t>Další autorova díla:</w:t>
       </w:r>
       <w:r>
-        <w:t xml:space="preserve"> </w:t>
-      </w:r>
-      <w:r>
-        <w:t>Zlatovláska, České pohádky</w:t>
+        <w:t xml:space="preserve"> České pohádky</w:t>
       </w:r>
     </w:p>
     <w:p>
@@ -5796,10 +5847,2213 @@
         <w:t xml:space="preserve"> romantismus</w:t>
       </w:r>
       <w:r>
+        <w:t xml:space="preserve"> - </w:t>
+      </w:r>
+      <w:r>
+        <w:t>upřednostňuje cit, vášeň, individualitu a fantazii před rozumem</w:t>
+      </w:r>
+      <w:r>
         <w:t xml:space="preserve">, </w:t>
       </w:r>
       <w:r>
-        <w:t>Další autoři – Karel Hynek Mácha – Máj, Božena Němcová – Babička</w:t>
+        <w:t>Další autoři –</w:t>
+      </w:r>
+      <w:r>
+        <w:t xml:space="preserve"> </w:t>
+      </w:r>
+      <w:r>
+        <w:t>Božena Němcová – Babička</w:t>
+      </w:r>
+    </w:p>
+    <w:p>
+      <w:r>
+        <w:br w:type="page"/>
+      </w:r>
+    </w:p>
+    <w:p>
+      <w:pPr>
+        <w:rPr>
+          <w:b/>
+          <w:bCs/>
+          <w:sz w:val="32"/>
+          <w:szCs w:val="32"/>
+        </w:rPr>
+      </w:pPr>
+      <w:r>
+        <w:rPr>
+          <w:b/>
+          <w:bCs/>
+          <w:sz w:val="32"/>
+          <w:szCs w:val="32"/>
+        </w:rPr>
+        <w:lastRenderedPageBreak/>
+        <w:t xml:space="preserve">Petr a Lucie – </w:t>
+      </w:r>
+      <w:r>
+        <w:rPr>
+          <w:b/>
+          <w:bCs/>
+          <w:sz w:val="32"/>
+          <w:szCs w:val="32"/>
+        </w:rPr>
+        <w:t>Romain Rolland</w:t>
+      </w:r>
+    </w:p>
+    <w:p>
+      <w:pPr>
+        <w:rPr>
+          <w:b/>
+          <w:bCs/>
+          <w:sz w:val="24"/>
+          <w:szCs w:val="24"/>
+          <w:u w:val="single"/>
+        </w:rPr>
+      </w:pPr>
+      <w:r>
+        <w:rPr>
+          <w:b/>
+          <w:bCs/>
+          <w:sz w:val="24"/>
+          <w:szCs w:val="24"/>
+          <w:u w:val="single"/>
+        </w:rPr>
+        <w:t>1.část</w:t>
+      </w:r>
+    </w:p>
+    <w:p>
+      <w:pPr>
+        <w:pStyle w:val="Bezmezer"/>
+      </w:pPr>
+      <w:r>
+        <w:rPr>
+          <w:b/>
+          <w:bCs/>
+        </w:rPr>
+        <w:t xml:space="preserve">Děj: </w:t>
+      </w:r>
+      <w:r>
+        <w:t xml:space="preserve"> Příběh začíná, když Petr nastoupí jednoho dne roku 1918 v Paříži do metra a spatří</w:t>
+      </w:r>
+    </w:p>
+    <w:p>
+      <w:pPr>
+        <w:pStyle w:val="Bezmezer"/>
+      </w:pPr>
+      <w:r>
+        <w:t>krásnou dívku. Osud jim dopřeje, aby se jejich ruce náhodou setkaly, když zazní výstřely</w:t>
+      </w:r>
+    </w:p>
+    <w:p>
+      <w:pPr>
+        <w:pStyle w:val="Bezmezer"/>
+      </w:pPr>
+      <w:r>
+        <w:t>a lidé začnou v metru panikařit. O několik dní později se mladý pár sejde již cíleně a</w:t>
+      </w:r>
+    </w:p>
+    <w:p>
+      <w:pPr>
+        <w:pStyle w:val="Bezmezer"/>
+      </w:pPr>
+      <w:r>
+        <w:t>začínají se pomalu poznávat. S postupujícím časem se do sebe hluboce zamilují.</w:t>
+      </w:r>
+    </w:p>
+    <w:p>
+      <w:pPr>
+        <w:pStyle w:val="Bezmezer"/>
+      </w:pPr>
+      <w:r>
+        <w:t>Překážka jejich vztahu je Petrovo povolání do armády. Rozhodnou se proto, že se</w:t>
+      </w:r>
+    </w:p>
+    <w:p>
+      <w:pPr>
+        <w:pStyle w:val="Bezmezer"/>
+      </w:pPr>
+      <w:r>
+        <w:t>zasnoubí. Na Velký Pátek si jdou poslechnout chór do kostela. Paříž je zrovna v těch</w:t>
+      </w:r>
+    </w:p>
+    <w:p>
+      <w:pPr>
+        <w:pStyle w:val="Bezmezer"/>
+      </w:pPr>
+      <w:r>
+        <w:t>dnech silně ostřelována a zřítí se rovněž i kostelem, ve kterém se Petr s Lucií nacházejí.</w:t>
+      </w:r>
+    </w:p>
+    <w:p>
+      <w:r>
+        <w:t>Oba milenci tak umírají.</w:t>
+      </w:r>
+    </w:p>
+    <w:p>
+      <w:r>
+        <w:rPr>
+          <w:b/>
+          <w:bCs/>
+        </w:rPr>
+        <w:t xml:space="preserve">Téma: </w:t>
+      </w:r>
+      <w:r>
+        <w:t>tragická láska v době války</w:t>
+      </w:r>
+    </w:p>
+    <w:p>
+      <w:r>
+        <w:rPr>
+          <w:b/>
+          <w:bCs/>
+        </w:rPr>
+        <w:t>Motivy</w:t>
+      </w:r>
+      <w:r>
+        <w:rPr>
+          <w:b/>
+          <w:bCs/>
+        </w:rPr>
+        <w:t>:</w:t>
+      </w:r>
+      <w:r>
+        <w:t xml:space="preserve"> láska, válka, smrt, mládí, naděje, osud</w:t>
+      </w:r>
+      <w:r>
+        <w:t xml:space="preserve"> </w:t>
+      </w:r>
+    </w:p>
+    <w:p>
+      <w:r>
+        <w:rPr>
+          <w:b/>
+          <w:bCs/>
+        </w:rPr>
+        <w:t>Časoprostor</w:t>
+      </w:r>
+      <w:r>
+        <w:rPr>
+          <w:b/>
+          <w:bCs/>
+        </w:rPr>
+        <w:t xml:space="preserve">: </w:t>
+      </w:r>
+      <w:r>
+        <w:t>Paříž během první světové války (počátek 20. století)</w:t>
+      </w:r>
+    </w:p>
+    <w:p>
+      <w:r>
+        <w:rPr>
+          <w:b/>
+          <w:bCs/>
+        </w:rPr>
+        <w:t>Kompozice</w:t>
+      </w:r>
+      <w:r>
+        <w:t xml:space="preserve">: </w:t>
+      </w:r>
+      <w:r>
+        <w:t>chronologicky</w:t>
+      </w:r>
+    </w:p>
+    <w:p>
+      <w:r>
+        <w:rPr>
+          <w:b/>
+          <w:bCs/>
+        </w:rPr>
+        <w:t>Lit. Druh a žánr</w:t>
+      </w:r>
+      <w:r>
+        <w:t xml:space="preserve">: </w:t>
+      </w:r>
+      <w:r>
+        <w:t>Epika, novela</w:t>
+      </w:r>
+    </w:p>
+    <w:p>
+      <w:pPr>
+        <w:rPr>
+          <w:b/>
+          <w:bCs/>
+          <w:sz w:val="24"/>
+          <w:szCs w:val="24"/>
+          <w:u w:val="single"/>
+        </w:rPr>
+      </w:pPr>
+      <w:r>
+        <w:rPr>
+          <w:b/>
+          <w:bCs/>
+          <w:sz w:val="24"/>
+          <w:szCs w:val="24"/>
+          <w:u w:val="single"/>
+        </w:rPr>
+        <w:t xml:space="preserve">2. část </w:t>
+      </w:r>
+    </w:p>
+    <w:p>
+      <w:r>
+        <w:rPr>
+          <w:b/>
+          <w:bCs/>
+        </w:rPr>
+        <w:t>Postavy</w:t>
+      </w:r>
+      <w:r>
+        <w:rPr>
+          <w:b/>
+          <w:bCs/>
+        </w:rPr>
+        <w:t xml:space="preserve">: </w:t>
+      </w:r>
+      <w:r>
+        <w:rPr>
+          <w:b/>
+          <w:bCs/>
+        </w:rPr>
+        <w:t xml:space="preserve">Petr – </w:t>
+      </w:r>
+      <w:r>
+        <w:t>citlivý, přemýšlivý, milující, student</w:t>
+      </w:r>
+      <w:r>
+        <w:br/>
+      </w:r>
+      <w:r>
+        <w:rPr>
+          <w:b/>
+          <w:bCs/>
+        </w:rPr>
+        <w:t xml:space="preserve">                    </w:t>
+      </w:r>
+      <w:r>
+        <w:rPr>
+          <w:b/>
+          <w:bCs/>
+        </w:rPr>
+        <w:t xml:space="preserve">Lucie – </w:t>
+      </w:r>
+      <w:r>
+        <w:t>laskavá, něžná, skromná, citlivá</w:t>
+      </w:r>
+    </w:p>
+    <w:p>
+      <w:pPr>
+        <w:rPr>
+          <w:b/>
+          <w:bCs/>
+          <w:sz w:val="24"/>
+          <w:szCs w:val="24"/>
+          <w:u w:val="single"/>
+        </w:rPr>
+      </w:pPr>
+      <w:r>
+        <w:rPr>
+          <w:b/>
+          <w:bCs/>
+          <w:sz w:val="24"/>
+          <w:szCs w:val="24"/>
+          <w:u w:val="single"/>
+        </w:rPr>
+        <w:t>3.část</w:t>
+      </w:r>
+      <w:r>
+        <w:rPr>
+          <w:b/>
+          <w:bCs/>
+          <w:sz w:val="24"/>
+          <w:szCs w:val="24"/>
+          <w:u w:val="single"/>
+        </w:rPr>
+        <w:t xml:space="preserve"> </w:t>
+      </w:r>
+    </w:p>
+    <w:p>
+      <w:r>
+        <w:rPr>
+          <w:b/>
+          <w:bCs/>
+        </w:rPr>
+        <w:t>Další autorova díla:</w:t>
+      </w:r>
+      <w:r>
+        <w:t xml:space="preserve"> </w:t>
+      </w:r>
+      <w:r>
+        <w:t>Okouzlená duše</w:t>
+      </w:r>
+    </w:p>
+    <w:p>
+      <w:r>
+        <w:rPr>
+          <w:b/>
+          <w:bCs/>
+        </w:rPr>
+        <w:t>Literárně/kulturní kontext:</w:t>
+      </w:r>
+      <w:r>
+        <w:rPr>
+          <w:b/>
+          <w:bCs/>
+        </w:rPr>
+        <w:t xml:space="preserve"> </w:t>
+      </w:r>
+      <w:r>
+        <w:t>1. polovina 20. století, protiválečná literatura, další autoři – Erich Maria Remarque</w:t>
+      </w:r>
+      <w:r>
+        <w:t xml:space="preserve"> – Na západní frontě klid</w:t>
+      </w:r>
+    </w:p>
+    <w:p>
+      <w:r>
+        <w:br w:type="page"/>
+      </w:r>
+    </w:p>
+    <w:p>
+      <w:pPr>
+        <w:rPr>
+          <w:b/>
+          <w:bCs/>
+          <w:sz w:val="32"/>
+          <w:szCs w:val="32"/>
+        </w:rPr>
+      </w:pPr>
+      <w:r>
+        <w:rPr>
+          <w:b/>
+          <w:bCs/>
+          <w:sz w:val="32"/>
+          <w:szCs w:val="32"/>
+        </w:rPr>
+        <w:lastRenderedPageBreak/>
+        <w:t>1984</w:t>
+      </w:r>
+      <w:r>
+        <w:rPr>
+          <w:b/>
+          <w:bCs/>
+          <w:sz w:val="32"/>
+          <w:szCs w:val="32"/>
+        </w:rPr>
+        <w:t xml:space="preserve"> – </w:t>
+      </w:r>
+      <w:r>
+        <w:rPr>
+          <w:b/>
+          <w:bCs/>
+          <w:sz w:val="32"/>
+          <w:szCs w:val="32"/>
+        </w:rPr>
+        <w:t>Orwell George</w:t>
+      </w:r>
+    </w:p>
+    <w:p>
+      <w:pPr>
+        <w:rPr>
+          <w:b/>
+          <w:bCs/>
+          <w:sz w:val="24"/>
+          <w:szCs w:val="24"/>
+          <w:u w:val="single"/>
+        </w:rPr>
+      </w:pPr>
+      <w:r>
+        <w:rPr>
+          <w:b/>
+          <w:bCs/>
+          <w:sz w:val="24"/>
+          <w:szCs w:val="24"/>
+          <w:u w:val="single"/>
+        </w:rPr>
+        <w:t>1.část</w:t>
+      </w:r>
+    </w:p>
+    <w:p>
+      <w:pPr>
+        <w:pStyle w:val="Bezmezer"/>
+      </w:pPr>
+      <w:r>
+        <w:rPr>
+          <w:b/>
+          <w:bCs/>
+        </w:rPr>
+        <w:t xml:space="preserve">Děj: </w:t>
+      </w:r>
+      <w:r>
+        <w:t xml:space="preserve"> </w:t>
+      </w:r>
+      <w:r>
+        <w:t xml:space="preserve">Příběh se odehrává v totalitním státě Oceánie, kde vládne Strana v čele s Velkým bratrem. Hlavní hrdina Winston Smith pracuje na Ministerstvu pravdy, kde </w:t>
+      </w:r>
+      <w:r>
+        <w:t>přepisuje historické záznamy</w:t>
+      </w:r>
+      <w:r>
+        <w:t xml:space="preserve"> tak, aby odpovídaly aktuální propagandě Strany. Postupně začíná pochybovat o režimu a tajně se proti němu bouří. Seznámí se s Julií, do které se zamiluje, a spolu začnou tajný vztah a snaží se vzdorovat systému. Myslí si, že se připojí k odboji proti Straně, ale nakonec jsou zrazeni a zatčeni. Winston je mučen na </w:t>
+      </w:r>
+      <w:r>
+        <w:t>M</w:t>
+      </w:r>
+      <w:r>
+        <w:t>inisterstvu, kde ho zlomí a donutí zradit Julii. Nakonec Winston ztratí svou osobnost a začne Velkého bratra skutečně milovat.</w:t>
+      </w:r>
+    </w:p>
+    <w:p>
+      <w:r>
+        <w:rPr>
+          <w:b/>
+          <w:bCs/>
+        </w:rPr>
+        <w:t xml:space="preserve">Téma: </w:t>
+      </w:r>
+      <w:r>
+        <w:t>kritika totalitního režimu</w:t>
+      </w:r>
+    </w:p>
+    <w:p>
+      <w:r>
+        <w:rPr>
+          <w:b/>
+          <w:bCs/>
+        </w:rPr>
+        <w:t>Motivy</w:t>
+      </w:r>
+      <w:r>
+        <w:rPr>
+          <w:b/>
+          <w:bCs/>
+        </w:rPr>
+        <w:t>:</w:t>
+      </w:r>
+      <w:r>
+        <w:t xml:space="preserve"> </w:t>
+      </w:r>
+      <w:r>
+        <w:t>propaganda, kontrola, strach, manipulace</w:t>
+      </w:r>
+    </w:p>
+    <w:p>
+      <w:r>
+        <w:rPr>
+          <w:b/>
+          <w:bCs/>
+        </w:rPr>
+        <w:t>Časoprostor</w:t>
+      </w:r>
+      <w:r>
+        <w:rPr>
+          <w:b/>
+          <w:bCs/>
+        </w:rPr>
+        <w:t xml:space="preserve">: </w:t>
+      </w:r>
+      <w:r>
+        <w:t>Oceánie (Londýn), 1984</w:t>
+      </w:r>
+    </w:p>
+    <w:p>
+      <w:r>
+        <w:rPr>
+          <w:b/>
+          <w:bCs/>
+        </w:rPr>
+        <w:t>Kompozice</w:t>
+      </w:r>
+      <w:r>
+        <w:t xml:space="preserve">: </w:t>
+      </w:r>
+      <w:r>
+        <w:t>chronologicky</w:t>
+      </w:r>
+    </w:p>
+    <w:p>
+      <w:r>
+        <w:rPr>
+          <w:b/>
+          <w:bCs/>
+        </w:rPr>
+        <w:t>Lit. Druh a žánr</w:t>
+      </w:r>
+      <w:r>
+        <w:t xml:space="preserve">: </w:t>
+      </w:r>
+      <w:r>
+        <w:t xml:space="preserve">Epika, </w:t>
+      </w:r>
+      <w:r>
+        <w:t>román</w:t>
+      </w:r>
+    </w:p>
+    <w:p>
+      <w:pPr>
+        <w:rPr>
+          <w:b/>
+          <w:bCs/>
+          <w:sz w:val="24"/>
+          <w:szCs w:val="24"/>
+          <w:u w:val="single"/>
+        </w:rPr>
+      </w:pPr>
+      <w:r>
+        <w:rPr>
+          <w:b/>
+          <w:bCs/>
+          <w:sz w:val="24"/>
+          <w:szCs w:val="24"/>
+          <w:u w:val="single"/>
+        </w:rPr>
+        <w:t xml:space="preserve">2. část </w:t>
+      </w:r>
+    </w:p>
+    <w:p>
+      <w:r>
+        <w:rPr>
+          <w:b/>
+          <w:bCs/>
+        </w:rPr>
+        <w:t>Postavy</w:t>
+      </w:r>
+      <w:r>
+        <w:rPr>
+          <w:b/>
+          <w:bCs/>
+        </w:rPr>
+        <w:t xml:space="preserve">: </w:t>
+      </w:r>
+      <w:r>
+        <w:rPr>
+          <w:b/>
+          <w:bCs/>
+        </w:rPr>
+        <w:t xml:space="preserve"> </w:t>
+      </w:r>
+      <w:r>
+        <w:rPr>
+          <w:b/>
+          <w:bCs/>
+        </w:rPr>
+        <w:t xml:space="preserve">Winston Smith – </w:t>
+      </w:r>
+      <w:r>
+        <w:t>inteligentní, přemýšlivý, odvážný, ale nakonec zlomený režimem</w:t>
+      </w:r>
+      <w:r>
+        <w:rPr>
+          <w:b/>
+          <w:bCs/>
+        </w:rPr>
+        <w:br/>
+      </w:r>
+      <w:r>
+        <w:rPr>
+          <w:b/>
+          <w:bCs/>
+        </w:rPr>
+        <w:t xml:space="preserve">                     </w:t>
+      </w:r>
+      <w:r>
+        <w:rPr>
+          <w:b/>
+          <w:bCs/>
+        </w:rPr>
+        <w:t xml:space="preserve">Julie – </w:t>
+      </w:r>
+      <w:r>
+        <w:t>odvážná, vzpurná, praktická, tajně odporuje Straně</w:t>
+      </w:r>
+      <w:r>
+        <w:rPr>
+          <w:b/>
+          <w:bCs/>
+        </w:rPr>
+        <w:br/>
+      </w:r>
+      <w:r>
+        <w:rPr>
+          <w:b/>
+          <w:bCs/>
+        </w:rPr>
+        <w:t xml:space="preserve">                     </w:t>
+      </w:r>
+      <w:proofErr w:type="spellStart"/>
+      <w:r>
+        <w:rPr>
+          <w:b/>
+          <w:bCs/>
+        </w:rPr>
+        <w:t>O’Brien</w:t>
+      </w:r>
+      <w:proofErr w:type="spellEnd"/>
+      <w:r>
+        <w:rPr>
+          <w:b/>
+          <w:bCs/>
+        </w:rPr>
+        <w:t xml:space="preserve"> – </w:t>
+      </w:r>
+      <w:r>
+        <w:t>člen Strany, který předstírá odpor proti režimu, ale nakonec Winstona zradí</w:t>
+      </w:r>
+      <w:r>
+        <w:rPr>
+          <w:b/>
+          <w:bCs/>
+        </w:rPr>
+        <w:br/>
+      </w:r>
+      <w:r>
+        <w:rPr>
+          <w:b/>
+          <w:bCs/>
+        </w:rPr>
+        <w:t xml:space="preserve">                    </w:t>
+      </w:r>
+      <w:r>
+        <w:rPr>
+          <w:b/>
+          <w:bCs/>
+        </w:rPr>
+        <w:t xml:space="preserve">Velký bratr – </w:t>
+      </w:r>
+      <w:r>
+        <w:t>symbol absolutní moci a kontroly Strany</w:t>
+      </w:r>
+    </w:p>
+    <w:p>
+      <w:pPr>
+        <w:rPr>
+          <w:b/>
+          <w:bCs/>
+          <w:sz w:val="24"/>
+          <w:szCs w:val="24"/>
+          <w:u w:val="single"/>
+        </w:rPr>
+      </w:pPr>
+      <w:r>
+        <w:rPr>
+          <w:b/>
+          <w:bCs/>
+          <w:sz w:val="24"/>
+          <w:szCs w:val="24"/>
+          <w:u w:val="single"/>
+        </w:rPr>
+        <w:t>3.část</w:t>
+      </w:r>
+      <w:r>
+        <w:rPr>
+          <w:b/>
+          <w:bCs/>
+          <w:sz w:val="24"/>
+          <w:szCs w:val="24"/>
+          <w:u w:val="single"/>
+        </w:rPr>
+        <w:t xml:space="preserve"> </w:t>
+      </w:r>
+    </w:p>
+    <w:p>
+      <w:r>
+        <w:rPr>
+          <w:b/>
+          <w:bCs/>
+        </w:rPr>
+        <w:t>Další autorova díla:</w:t>
+      </w:r>
+      <w:r>
+        <w:t xml:space="preserve"> </w:t>
+      </w:r>
+      <w:r>
+        <w:t>Farma zvířat</w:t>
+      </w:r>
+    </w:p>
+    <w:p>
+      <w:r>
+        <w:rPr>
+          <w:b/>
+          <w:bCs/>
+        </w:rPr>
+        <w:t>Literárně/kulturní kontext:</w:t>
+      </w:r>
+      <w:r>
+        <w:rPr>
+          <w:b/>
+          <w:bCs/>
+        </w:rPr>
+        <w:t xml:space="preserve"> </w:t>
+      </w:r>
+      <w:r>
+        <w:t>20. století, dystopická literatura</w:t>
+      </w:r>
+      <w:r>
+        <w:t xml:space="preserve"> - </w:t>
+      </w:r>
+      <w:r>
+        <w:t>žánr fikce zobrazující fiktivní společnost, která se vyvinula špatným směrem, často pod totalitní kontrolou, s potlačenou svobodou a dehumanizací</w:t>
+      </w:r>
+      <w:r>
+        <w:t xml:space="preserve">, </w:t>
+      </w:r>
+      <w:r>
+        <w:t xml:space="preserve">další autoři – </w:t>
+      </w:r>
+      <w:proofErr w:type="spellStart"/>
+      <w:r>
+        <w:t>Ray</w:t>
+      </w:r>
+      <w:proofErr w:type="spellEnd"/>
+      <w:r>
+        <w:t xml:space="preserve"> </w:t>
+      </w:r>
+      <w:proofErr w:type="spellStart"/>
+      <w:r>
+        <w:t>Bradbury</w:t>
+      </w:r>
+      <w:proofErr w:type="spellEnd"/>
+      <w:r>
+        <w:t xml:space="preserve">, </w:t>
+      </w:r>
+    </w:p>
+    <w:p>
+      <w:r>
+        <w:br w:type="page"/>
+      </w:r>
+    </w:p>
+    <w:p>
+      <w:pPr>
+        <w:rPr>
+          <w:b/>
+          <w:bCs/>
+          <w:sz w:val="32"/>
+          <w:szCs w:val="32"/>
+        </w:rPr>
+      </w:pPr>
+      <w:r>
+        <w:rPr>
+          <w:b/>
+          <w:bCs/>
+          <w:sz w:val="32"/>
+          <w:szCs w:val="32"/>
+        </w:rPr>
+        <w:lastRenderedPageBreak/>
+        <w:t xml:space="preserve">O myších a lidech – </w:t>
+      </w:r>
+      <w:r>
+        <w:rPr>
+          <w:b/>
+          <w:bCs/>
+          <w:sz w:val="32"/>
+          <w:szCs w:val="32"/>
+        </w:rPr>
+        <w:t>John Steinbeck</w:t>
+      </w:r>
+    </w:p>
+    <w:p>
+      <w:pPr>
+        <w:rPr>
+          <w:b/>
+          <w:bCs/>
+          <w:sz w:val="24"/>
+          <w:szCs w:val="24"/>
+          <w:u w:val="single"/>
+        </w:rPr>
+      </w:pPr>
+      <w:r>
+        <w:rPr>
+          <w:b/>
+          <w:bCs/>
+          <w:sz w:val="24"/>
+          <w:szCs w:val="24"/>
+          <w:u w:val="single"/>
+        </w:rPr>
+        <w:t>1.část</w:t>
+      </w:r>
+    </w:p>
+    <w:p>
+      <w:pPr>
+        <w:pStyle w:val="Bezmezer"/>
+      </w:pPr>
+      <w:r>
+        <w:rPr>
+          <w:b/>
+          <w:bCs/>
+        </w:rPr>
+        <w:t xml:space="preserve">Děj: </w:t>
+      </w:r>
+      <w:r>
+        <w:t xml:space="preserve"> </w:t>
+      </w:r>
+      <w:r>
+        <w:t xml:space="preserve">Příběh vypráví o dvou přátelích, Georgovi a </w:t>
+      </w:r>
+      <w:proofErr w:type="spellStart"/>
+      <w:r>
+        <w:t>Lennym</w:t>
+      </w:r>
+      <w:proofErr w:type="spellEnd"/>
+      <w:r>
+        <w:t xml:space="preserve">, kteří spolu putují za prací během hospodářské krize v USA. </w:t>
+      </w:r>
+      <w:proofErr w:type="spellStart"/>
+      <w:r>
+        <w:t>Lennie</w:t>
+      </w:r>
+      <w:proofErr w:type="spellEnd"/>
+      <w:r>
+        <w:t xml:space="preserve"> je silný, ale mentálně zaostalý muž, který má rád měkké věci a často si neuvědomuje svou sílu. George se o něj stará a společně sní o tom, že si jednou koupí vlastní farmu a budou žít nezávisle. Začnou pracovat na ranči, kde se setkají s dalšími dělníky. </w:t>
+      </w:r>
+      <w:proofErr w:type="spellStart"/>
+      <w:r>
+        <w:t>Lennie</w:t>
+      </w:r>
+      <w:proofErr w:type="spellEnd"/>
+      <w:r>
+        <w:t xml:space="preserve"> však nechtěně způsobí několik problémů, a nakonec omylem zabije </w:t>
+      </w:r>
+      <w:proofErr w:type="spellStart"/>
+      <w:r>
+        <w:t>Curleyho</w:t>
+      </w:r>
+      <w:proofErr w:type="spellEnd"/>
+      <w:r>
+        <w:t xml:space="preserve"> ženu, když se snaží hladit její vlasy. Ostatní muži se ho vydají hledat, aby ho potrestali. George ví, že by </w:t>
+      </w:r>
+      <w:proofErr w:type="spellStart"/>
+      <w:r>
+        <w:t>Lennie</w:t>
+      </w:r>
+      <w:proofErr w:type="spellEnd"/>
+      <w:r>
+        <w:t xml:space="preserve"> skončil krutě, a proto ho ze soucitu sám zastřelí.</w:t>
+      </w:r>
+    </w:p>
+    <w:p>
+      <w:r>
+        <w:rPr>
+          <w:b/>
+          <w:bCs/>
+        </w:rPr>
+        <w:t xml:space="preserve">Téma: </w:t>
+      </w:r>
+      <w:r>
+        <w:t>Přátelství a osamělost</w:t>
+      </w:r>
+    </w:p>
+    <w:p>
+      <w:r>
+        <w:rPr>
+          <w:b/>
+          <w:bCs/>
+        </w:rPr>
+        <w:t>Motivy</w:t>
+      </w:r>
+      <w:r>
+        <w:rPr>
+          <w:b/>
+          <w:bCs/>
+        </w:rPr>
+        <w:t>:</w:t>
+      </w:r>
+      <w:r>
+        <w:t xml:space="preserve"> </w:t>
+      </w:r>
+      <w:r>
+        <w:t>přátelství, sen o lepším životě, samota,</w:t>
+      </w:r>
+      <w:r>
+        <w:t xml:space="preserve"> </w:t>
+      </w:r>
+      <w:r>
+        <w:t>násilí</w:t>
+      </w:r>
+      <w:r>
+        <w:t>, touha</w:t>
+      </w:r>
+    </w:p>
+    <w:p>
+      <w:r>
+        <w:rPr>
+          <w:b/>
+          <w:bCs/>
+        </w:rPr>
+        <w:t>Časoprostor</w:t>
+      </w:r>
+      <w:r>
+        <w:rPr>
+          <w:b/>
+          <w:bCs/>
+        </w:rPr>
+        <w:t xml:space="preserve">: </w:t>
+      </w:r>
+      <w:r>
+        <w:t>USA (Kalifornie), období hospodářské krize ve 30. letech 20. století</w:t>
+      </w:r>
+    </w:p>
+    <w:p>
+      <w:r>
+        <w:rPr>
+          <w:b/>
+          <w:bCs/>
+        </w:rPr>
+        <w:t>Kompozice</w:t>
+      </w:r>
+      <w:r>
+        <w:t xml:space="preserve">: </w:t>
+      </w:r>
+      <w:r>
+        <w:t>chronologicky</w:t>
+      </w:r>
+    </w:p>
+    <w:p>
+      <w:r>
+        <w:rPr>
+          <w:b/>
+          <w:bCs/>
+        </w:rPr>
+        <w:t>Lit. Druh a žánr</w:t>
+      </w:r>
+      <w:r>
+        <w:t xml:space="preserve">: </w:t>
+      </w:r>
+      <w:r>
+        <w:t>Epika, novela</w:t>
+      </w:r>
+    </w:p>
+    <w:p>
+      <w:pPr>
+        <w:rPr>
+          <w:b/>
+          <w:bCs/>
+          <w:sz w:val="24"/>
+          <w:szCs w:val="24"/>
+          <w:u w:val="single"/>
+        </w:rPr>
+      </w:pPr>
+      <w:r>
+        <w:rPr>
+          <w:b/>
+          <w:bCs/>
+          <w:sz w:val="24"/>
+          <w:szCs w:val="24"/>
+          <w:u w:val="single"/>
+        </w:rPr>
+        <w:t xml:space="preserve">2. část </w:t>
+      </w:r>
+    </w:p>
+    <w:p>
+      <w:r>
+        <w:rPr>
+          <w:b/>
+          <w:bCs/>
+        </w:rPr>
+        <w:t>Postavy</w:t>
+      </w:r>
+      <w:r>
+        <w:rPr>
+          <w:b/>
+          <w:bCs/>
+        </w:rPr>
+        <w:t xml:space="preserve">: </w:t>
+      </w:r>
+      <w:r>
+        <w:rPr>
+          <w:b/>
+          <w:bCs/>
+        </w:rPr>
+        <w:t xml:space="preserve"> </w:t>
+      </w:r>
+      <w:r>
+        <w:rPr>
+          <w:b/>
+          <w:bCs/>
+        </w:rPr>
+        <w:t xml:space="preserve">George – </w:t>
+      </w:r>
+      <w:r>
+        <w:t xml:space="preserve">rozumný, starostlivý, zodpovědný, chrání </w:t>
+      </w:r>
+      <w:proofErr w:type="spellStart"/>
+      <w:r>
+        <w:t>Lennieho</w:t>
+      </w:r>
+      <w:proofErr w:type="spellEnd"/>
+      <w:r>
+        <w:rPr>
+          <w:b/>
+          <w:bCs/>
+        </w:rPr>
+        <w:br/>
+      </w:r>
+      <w:r>
+        <w:rPr>
+          <w:b/>
+          <w:bCs/>
+        </w:rPr>
+        <w:t xml:space="preserve">                     </w:t>
+      </w:r>
+      <w:proofErr w:type="spellStart"/>
+      <w:r>
+        <w:rPr>
+          <w:b/>
+          <w:bCs/>
+        </w:rPr>
+        <w:t>Lennie</w:t>
+      </w:r>
+      <w:proofErr w:type="spellEnd"/>
+      <w:r>
+        <w:rPr>
+          <w:b/>
+          <w:bCs/>
+        </w:rPr>
+        <w:t xml:space="preserve"> – </w:t>
+      </w:r>
+      <w:r>
+        <w:t>fyzicky silný, dobrosrdečný, ale mentálně zaostalý</w:t>
+      </w:r>
+      <w:r>
+        <w:rPr>
+          <w:b/>
+          <w:bCs/>
+        </w:rPr>
+        <w:br/>
+      </w:r>
+      <w:r>
+        <w:rPr>
+          <w:b/>
+          <w:bCs/>
+        </w:rPr>
+        <w:t xml:space="preserve">                     </w:t>
+      </w:r>
+      <w:proofErr w:type="spellStart"/>
+      <w:r>
+        <w:rPr>
+          <w:b/>
+          <w:bCs/>
+        </w:rPr>
+        <w:t>Candy</w:t>
+      </w:r>
+      <w:proofErr w:type="spellEnd"/>
+      <w:r>
+        <w:rPr>
+          <w:b/>
+          <w:bCs/>
+        </w:rPr>
+        <w:t xml:space="preserve"> – </w:t>
+      </w:r>
+      <w:r>
+        <w:t>starý dělník, osamělý, chce se přidat k jejich snu o farmě</w:t>
+      </w:r>
+      <w:r>
+        <w:rPr>
+          <w:b/>
+          <w:bCs/>
+        </w:rPr>
+        <w:br/>
+      </w:r>
+      <w:r>
+        <w:rPr>
+          <w:b/>
+          <w:bCs/>
+        </w:rPr>
+        <w:t xml:space="preserve">                     </w:t>
+      </w:r>
+      <w:proofErr w:type="spellStart"/>
+      <w:r>
+        <w:rPr>
+          <w:b/>
+          <w:bCs/>
+        </w:rPr>
+        <w:t>Curley</w:t>
+      </w:r>
+      <w:proofErr w:type="spellEnd"/>
+      <w:r>
+        <w:rPr>
+          <w:b/>
+          <w:bCs/>
+        </w:rPr>
+        <w:t xml:space="preserve"> – </w:t>
+      </w:r>
+      <w:r>
+        <w:t>agresivní syn majitele ranče</w:t>
+      </w:r>
+      <w:r>
+        <w:rPr>
+          <w:b/>
+          <w:bCs/>
+        </w:rPr>
+        <w:br/>
+      </w:r>
+      <w:r>
+        <w:rPr>
+          <w:b/>
+          <w:bCs/>
+        </w:rPr>
+        <w:t xml:space="preserve">                     </w:t>
+      </w:r>
+      <w:proofErr w:type="spellStart"/>
+      <w:r>
+        <w:rPr>
+          <w:b/>
+          <w:bCs/>
+        </w:rPr>
+        <w:t>Curleyho</w:t>
+      </w:r>
+      <w:proofErr w:type="spellEnd"/>
+      <w:r>
+        <w:rPr>
+          <w:b/>
+          <w:bCs/>
+        </w:rPr>
+        <w:t xml:space="preserve"> žena – </w:t>
+      </w:r>
+      <w:r>
+        <w:t>osamělá, touží po pozornosti a lepším životě</w:t>
+      </w:r>
+    </w:p>
+    <w:p>
+      <w:pPr>
+        <w:rPr>
+          <w:b/>
+          <w:bCs/>
+          <w:sz w:val="24"/>
+          <w:szCs w:val="24"/>
+          <w:u w:val="single"/>
+        </w:rPr>
+      </w:pPr>
+      <w:r>
+        <w:rPr>
+          <w:b/>
+          <w:bCs/>
+          <w:sz w:val="24"/>
+          <w:szCs w:val="24"/>
+          <w:u w:val="single"/>
+        </w:rPr>
+        <w:t>3.část</w:t>
+      </w:r>
+      <w:r>
+        <w:rPr>
+          <w:b/>
+          <w:bCs/>
+          <w:sz w:val="24"/>
+          <w:szCs w:val="24"/>
+          <w:u w:val="single"/>
+        </w:rPr>
+        <w:t xml:space="preserve"> </w:t>
+      </w:r>
+    </w:p>
+    <w:p>
+      <w:r>
+        <w:rPr>
+          <w:b/>
+          <w:bCs/>
+        </w:rPr>
+        <w:t>Další autorova díla:</w:t>
+      </w:r>
+      <w:r>
+        <w:rPr>
+          <w:b/>
+          <w:bCs/>
+        </w:rPr>
+        <w:t xml:space="preserve"> </w:t>
+      </w:r>
+      <w:r>
+        <w:t>Hrozny hněvu, Na východ od ráje</w:t>
+      </w:r>
+      <w:r>
+        <w:t xml:space="preserve"> </w:t>
+      </w:r>
+    </w:p>
+    <w:p>
+      <w:r>
+        <w:rPr>
+          <w:b/>
+          <w:bCs/>
+        </w:rPr>
+        <w:t>Literárně/kulturní kontext:</w:t>
+      </w:r>
+      <w:r>
+        <w:rPr>
+          <w:b/>
+          <w:bCs/>
+        </w:rPr>
+        <w:t xml:space="preserve"> </w:t>
+      </w:r>
+      <w:r>
+        <w:t xml:space="preserve">20. století, americký realismus, literatura o hospodářské krizi v USA, další autoři – Ernest Hemingway, </w:t>
+      </w:r>
+    </w:p>
+    <w:p>
+      <w:r>
+        <w:br w:type="page"/>
+      </w:r>
+    </w:p>
+    <w:p/>
+    <w:p/>
+    <w:p>
+      <w:pPr>
+        <w:rPr>
+          <w:b/>
+          <w:bCs/>
+          <w:sz w:val="32"/>
+          <w:szCs w:val="32"/>
+        </w:rPr>
+      </w:pPr>
+      <w:r>
+        <w:rPr>
+          <w:b/>
+          <w:bCs/>
+          <w:sz w:val="32"/>
+          <w:szCs w:val="32"/>
+        </w:rPr>
+        <w:t>Spalovač mrtvol</w:t>
+      </w:r>
+      <w:r>
+        <w:rPr>
+          <w:b/>
+          <w:bCs/>
+          <w:sz w:val="32"/>
+          <w:szCs w:val="32"/>
+        </w:rPr>
+        <w:t xml:space="preserve"> – </w:t>
+      </w:r>
+      <w:r>
+        <w:rPr>
+          <w:b/>
+          <w:bCs/>
+          <w:sz w:val="32"/>
+          <w:szCs w:val="32"/>
+        </w:rPr>
+        <w:t>Ladislav Fuks</w:t>
+      </w:r>
+    </w:p>
+    <w:p>
+      <w:pPr>
+        <w:rPr>
+          <w:b/>
+          <w:bCs/>
+          <w:sz w:val="24"/>
+          <w:szCs w:val="24"/>
+          <w:u w:val="single"/>
+        </w:rPr>
+      </w:pPr>
+      <w:r>
+        <w:rPr>
+          <w:b/>
+          <w:bCs/>
+          <w:sz w:val="24"/>
+          <w:szCs w:val="24"/>
+          <w:u w:val="single"/>
+        </w:rPr>
+        <w:t>1.část</w:t>
+      </w:r>
+    </w:p>
+    <w:p>
+      <w:pPr>
+        <w:pStyle w:val="Bezmezer"/>
+      </w:pPr>
+      <w:r>
+        <w:rPr>
+          <w:b/>
+          <w:bCs/>
+        </w:rPr>
+        <w:t xml:space="preserve">Děj: </w:t>
+      </w:r>
+      <w:r>
+        <w:t xml:space="preserve"> </w:t>
+      </w:r>
+      <w:r>
+        <w:t xml:space="preserve">Příběh sleduje Karla </w:t>
+      </w:r>
+      <w:proofErr w:type="spellStart"/>
+      <w:r>
+        <w:t>Kopfrkingla</w:t>
+      </w:r>
+      <w:proofErr w:type="spellEnd"/>
+      <w:r>
+        <w:t xml:space="preserve">, zaměstnance krematoria v Praze, který svou práci považuje za poslání. Je posedlý myšlenkou smrti a věří, že spalování mrtvých osvobozuje duši. Postupně se dostává pod vliv nacistické ideologie a začíná věřit, že některé lidi je potřeba „očistit“. Pod tlakem propagandy a vlastních zvrácených představ začne udávat </w:t>
+      </w:r>
+      <w:proofErr w:type="gramStart"/>
+      <w:r>
+        <w:t>lidi</w:t>
+      </w:r>
+      <w:proofErr w:type="gramEnd"/>
+      <w:r>
+        <w:t xml:space="preserve"> a nakonec zavraždí i členy vlastní rodiny, protože mají židovský původ. </w:t>
+      </w:r>
+      <w:proofErr w:type="spellStart"/>
+      <w:r>
+        <w:t>Kopfrkingl</w:t>
+      </w:r>
+      <w:proofErr w:type="spellEnd"/>
+      <w:r>
+        <w:t xml:space="preserve"> se postupně propadá do šílenství a jeho posedlost smrtí a ideologií vede k tragickým činům.</w:t>
+      </w:r>
+    </w:p>
+    <w:p>
+      <w:r>
+        <w:rPr>
+          <w:b/>
+          <w:bCs/>
+        </w:rPr>
+        <w:t xml:space="preserve">Téma: </w:t>
+      </w:r>
+      <w:r>
+        <w:t>zlo v člověku a manipulace ideologií</w:t>
+      </w:r>
+    </w:p>
+    <w:p>
+      <w:r>
+        <w:rPr>
+          <w:b/>
+          <w:bCs/>
+        </w:rPr>
+        <w:t>Motivy</w:t>
+      </w:r>
+      <w:r>
+        <w:rPr>
+          <w:b/>
+          <w:bCs/>
+        </w:rPr>
+        <w:t>:</w:t>
+      </w:r>
+      <w:r>
+        <w:t xml:space="preserve"> </w:t>
+      </w:r>
+      <w:r>
+        <w:t>smrt, krematorium, propaganda, šílenství, vina, manipulace</w:t>
+      </w:r>
+    </w:p>
+    <w:p>
+      <w:r>
+        <w:rPr>
+          <w:b/>
+          <w:bCs/>
+        </w:rPr>
+        <w:t>Časoprostor</w:t>
+      </w:r>
+      <w:r>
+        <w:rPr>
+          <w:b/>
+          <w:bCs/>
+        </w:rPr>
+        <w:t xml:space="preserve">: </w:t>
+      </w:r>
+      <w:r>
+        <w:t>Praha před a během druhé světové války</w:t>
+      </w:r>
+    </w:p>
+    <w:p>
+      <w:r>
+        <w:rPr>
+          <w:b/>
+          <w:bCs/>
+        </w:rPr>
+        <w:t>Kompozice</w:t>
+      </w:r>
+      <w:r>
+        <w:t xml:space="preserve">: </w:t>
+      </w:r>
+      <w:r>
+        <w:t>chronologicky</w:t>
+      </w:r>
+    </w:p>
+    <w:p>
+      <w:r>
+        <w:rPr>
+          <w:b/>
+          <w:bCs/>
+        </w:rPr>
+        <w:t>Lit. Druh a žánr</w:t>
+      </w:r>
+      <w:r>
+        <w:t xml:space="preserve">: </w:t>
+      </w:r>
+      <w:r>
+        <w:t xml:space="preserve">Epika, </w:t>
+      </w:r>
+      <w:r>
+        <w:t>psychologický román</w:t>
+      </w:r>
+    </w:p>
+    <w:p>
+      <w:pPr>
+        <w:rPr>
+          <w:b/>
+          <w:bCs/>
+          <w:sz w:val="24"/>
+          <w:szCs w:val="24"/>
+          <w:u w:val="single"/>
+        </w:rPr>
+      </w:pPr>
+      <w:r>
+        <w:rPr>
+          <w:b/>
+          <w:bCs/>
+          <w:sz w:val="24"/>
+          <w:szCs w:val="24"/>
+          <w:u w:val="single"/>
+        </w:rPr>
+        <w:t xml:space="preserve">2. část </w:t>
+      </w:r>
+    </w:p>
+    <w:p>
+      <w:r>
+        <w:rPr>
+          <w:b/>
+          <w:bCs/>
+        </w:rPr>
+        <w:t>Postavy</w:t>
+      </w:r>
+      <w:r>
+        <w:rPr>
+          <w:b/>
+          <w:bCs/>
+        </w:rPr>
+        <w:t xml:space="preserve">: </w:t>
+      </w:r>
+      <w:r>
+        <w:rPr>
+          <w:b/>
+          <w:bCs/>
+        </w:rPr>
+        <w:t xml:space="preserve"> </w:t>
+      </w:r>
+      <w:r>
+        <w:rPr>
+          <w:b/>
+          <w:bCs/>
+        </w:rPr>
+        <w:t xml:space="preserve">Karel </w:t>
+      </w:r>
+      <w:proofErr w:type="spellStart"/>
+      <w:r>
+        <w:rPr>
+          <w:b/>
+          <w:bCs/>
+        </w:rPr>
+        <w:t>Kopfrkingl</w:t>
+      </w:r>
+      <w:proofErr w:type="spellEnd"/>
+      <w:r>
+        <w:rPr>
+          <w:b/>
+          <w:bCs/>
+        </w:rPr>
+        <w:t xml:space="preserve"> – </w:t>
+      </w:r>
+      <w:r>
+        <w:t>zdánlivě slušný, klidný, ale manipulovatelný a postupně šílený</w:t>
+      </w:r>
+      <w:r>
+        <w:rPr>
+          <w:b/>
+          <w:bCs/>
+        </w:rPr>
+        <w:br/>
+      </w:r>
+      <w:r>
+        <w:rPr>
+          <w:b/>
+          <w:bCs/>
+        </w:rPr>
+        <w:t xml:space="preserve">                     </w:t>
+      </w:r>
+      <w:r>
+        <w:rPr>
+          <w:b/>
+          <w:bCs/>
+        </w:rPr>
+        <w:t xml:space="preserve">Marie – </w:t>
+      </w:r>
+      <w:proofErr w:type="spellStart"/>
+      <w:r>
+        <w:t>Kopfrkinglova</w:t>
+      </w:r>
+      <w:proofErr w:type="spellEnd"/>
+      <w:r>
+        <w:t xml:space="preserve"> manželka, klidná, starostlivá</w:t>
+      </w:r>
+      <w:r>
+        <w:rPr>
+          <w:b/>
+          <w:bCs/>
+        </w:rPr>
+        <w:br/>
+      </w:r>
+      <w:r>
+        <w:rPr>
+          <w:b/>
+          <w:bCs/>
+        </w:rPr>
+        <w:t xml:space="preserve">                     </w:t>
+      </w:r>
+      <w:r>
+        <w:rPr>
+          <w:b/>
+          <w:bCs/>
+        </w:rPr>
+        <w:t xml:space="preserve">Zina – </w:t>
+      </w:r>
+      <w:r>
+        <w:t>jejich dcera</w:t>
+      </w:r>
+      <w:r>
+        <w:rPr>
+          <w:b/>
+          <w:bCs/>
+        </w:rPr>
+        <w:br/>
+      </w:r>
+      <w:r>
+        <w:rPr>
+          <w:b/>
+          <w:bCs/>
+        </w:rPr>
+        <w:t xml:space="preserve">                     </w:t>
+      </w:r>
+      <w:proofErr w:type="spellStart"/>
+      <w:r>
+        <w:rPr>
+          <w:b/>
+          <w:bCs/>
+        </w:rPr>
+        <w:t>Mili</w:t>
+      </w:r>
+      <w:proofErr w:type="spellEnd"/>
+      <w:r>
+        <w:rPr>
+          <w:b/>
+          <w:bCs/>
+        </w:rPr>
+        <w:t xml:space="preserve"> –</w:t>
+      </w:r>
+      <w:r>
+        <w:t xml:space="preserve"> jejich syn</w:t>
+      </w:r>
+      <w:r>
+        <w:rPr>
+          <w:b/>
+          <w:bCs/>
+        </w:rPr>
+        <w:br/>
+      </w:r>
+      <w:r>
+        <w:rPr>
+          <w:b/>
+          <w:bCs/>
+        </w:rPr>
+        <w:t xml:space="preserve">                     </w:t>
+      </w:r>
+      <w:proofErr w:type="spellStart"/>
+      <w:r>
+        <w:rPr>
+          <w:b/>
+          <w:bCs/>
+        </w:rPr>
+        <w:t>Reichsmann</w:t>
+      </w:r>
+      <w:proofErr w:type="spellEnd"/>
+      <w:r>
+        <w:rPr>
+          <w:b/>
+          <w:bCs/>
+        </w:rPr>
+        <w:t xml:space="preserve"> </w:t>
+      </w:r>
+      <w:r>
+        <w:rPr>
+          <w:b/>
+          <w:bCs/>
+        </w:rPr>
+        <w:t xml:space="preserve">– </w:t>
+      </w:r>
+      <w:proofErr w:type="spellStart"/>
+      <w:r>
+        <w:t>Kopfrkinglův</w:t>
+      </w:r>
+      <w:proofErr w:type="spellEnd"/>
+      <w:r>
+        <w:t xml:space="preserve"> známý, který ho ovlivňuje nacistickou ideologií</w:t>
+      </w:r>
+    </w:p>
+    <w:p>
+      <w:pPr>
+        <w:rPr>
+          <w:b/>
+          <w:bCs/>
+          <w:sz w:val="24"/>
+          <w:szCs w:val="24"/>
+          <w:u w:val="single"/>
+        </w:rPr>
+      </w:pPr>
+      <w:r>
+        <w:rPr>
+          <w:b/>
+          <w:bCs/>
+          <w:sz w:val="24"/>
+          <w:szCs w:val="24"/>
+          <w:u w:val="single"/>
+        </w:rPr>
+        <w:t>3.část</w:t>
+      </w:r>
+      <w:r>
+        <w:rPr>
+          <w:b/>
+          <w:bCs/>
+          <w:sz w:val="24"/>
+          <w:szCs w:val="24"/>
+          <w:u w:val="single"/>
+        </w:rPr>
+        <w:t xml:space="preserve"> </w:t>
+      </w:r>
+    </w:p>
+    <w:p>
+      <w:r>
+        <w:rPr>
+          <w:b/>
+          <w:bCs/>
+        </w:rPr>
+        <w:t>Další autorova díla:</w:t>
+      </w:r>
+      <w:r>
+        <w:rPr>
+          <w:b/>
+          <w:bCs/>
+        </w:rPr>
+        <w:t xml:space="preserve"> </w:t>
+      </w:r>
+      <w:r>
+        <w:t>Variace pro temnou strunu</w:t>
+      </w:r>
+    </w:p>
+    <w:p>
+      <w:r>
+        <w:rPr>
+          <w:b/>
+          <w:bCs/>
+        </w:rPr>
+        <w:t>Literárně/kulturní kontext:</w:t>
+      </w:r>
+      <w:r>
+        <w:rPr>
+          <w:b/>
+          <w:bCs/>
+        </w:rPr>
+        <w:t xml:space="preserve"> </w:t>
+      </w:r>
+      <w:r>
+        <w:t xml:space="preserve">česká literatura 2. poloviny 20. století, psychologická próza, reakce na druhou světovou válku a nacismus, další autoři – Bohumil Hrabal, </w:t>
+      </w:r>
+    </w:p>
+    <w:p>
+      <w:r>
+        <w:br w:type="page"/>
+      </w:r>
+    </w:p>
+    <w:p>
+      <w:pPr>
+        <w:rPr>
+          <w:b/>
+          <w:bCs/>
+          <w:sz w:val="32"/>
+          <w:szCs w:val="32"/>
+        </w:rPr>
+      </w:pPr>
+      <w:proofErr w:type="spellStart"/>
+      <w:r>
+        <w:rPr>
+          <w:b/>
+          <w:bCs/>
+          <w:sz w:val="32"/>
+          <w:szCs w:val="32"/>
+        </w:rPr>
+        <w:lastRenderedPageBreak/>
+        <w:t>Arila</w:t>
+      </w:r>
+      <w:proofErr w:type="spellEnd"/>
+      <w:r>
+        <w:rPr>
+          <w:b/>
+          <w:bCs/>
+          <w:sz w:val="32"/>
+          <w:szCs w:val="32"/>
+        </w:rPr>
+        <w:t xml:space="preserve"> Stříbrné město</w:t>
+      </w:r>
+      <w:r>
+        <w:rPr>
+          <w:b/>
+          <w:bCs/>
+          <w:sz w:val="32"/>
+          <w:szCs w:val="32"/>
+        </w:rPr>
+        <w:t xml:space="preserve"> – </w:t>
+      </w:r>
+      <w:r>
+        <w:rPr>
+          <w:b/>
+          <w:bCs/>
+          <w:sz w:val="32"/>
+          <w:szCs w:val="32"/>
+        </w:rPr>
+        <w:t>Radek Starý</w:t>
+      </w:r>
+    </w:p>
+    <w:p>
+      <w:pPr>
+        <w:rPr>
+          <w:b/>
+          <w:bCs/>
+          <w:sz w:val="24"/>
+          <w:szCs w:val="24"/>
+          <w:u w:val="single"/>
+        </w:rPr>
+      </w:pPr>
+      <w:r>
+        <w:rPr>
+          <w:b/>
+          <w:bCs/>
+          <w:sz w:val="24"/>
+          <w:szCs w:val="24"/>
+          <w:u w:val="single"/>
+        </w:rPr>
+        <w:t>1.část</w:t>
+      </w:r>
+    </w:p>
+    <w:p>
+      <w:pPr>
+        <w:rPr>
+          <w:b/>
+          <w:bCs/>
+        </w:rPr>
+      </w:pPr>
+      <w:r>
+        <w:rPr>
+          <w:b/>
+          <w:bCs/>
+        </w:rPr>
+        <w:t xml:space="preserve">Děj:  </w:t>
+      </w:r>
+      <w:r>
+        <w:t xml:space="preserve">Příběh se odehrává ve fantasy světě, který byl kdysi roztříštěn zásahy bohů. Národ </w:t>
+      </w:r>
+      <w:proofErr w:type="spellStart"/>
+      <w:r>
+        <w:t>Nurů</w:t>
+      </w:r>
+      <w:proofErr w:type="spellEnd"/>
+      <w:r>
+        <w:t xml:space="preserve"> proto už dva tisíce let neustále putuje z jednoho světa do druhého, aby unikl hněvu bohyně </w:t>
+      </w:r>
+      <w:proofErr w:type="spellStart"/>
+      <w:r>
+        <w:t>Kthaary</w:t>
+      </w:r>
+      <w:proofErr w:type="spellEnd"/>
+      <w:r>
+        <w:t xml:space="preserve">. </w:t>
+      </w:r>
+      <w:r>
+        <w:t>M</w:t>
+      </w:r>
+      <w:r>
+        <w:t xml:space="preserve">ladá léčitelka </w:t>
+      </w:r>
+      <w:proofErr w:type="spellStart"/>
+      <w:r>
+        <w:t>Arila</w:t>
+      </w:r>
+      <w:proofErr w:type="spellEnd"/>
+      <w:r>
+        <w:t xml:space="preserve">, která žije ve městě </w:t>
+      </w:r>
+      <w:proofErr w:type="spellStart"/>
+      <w:r>
+        <w:t>Nurheim</w:t>
+      </w:r>
+      <w:proofErr w:type="spellEnd"/>
+      <w:r>
+        <w:t>. Touží stát se hrdinkou, ale zároveň skrývá své schopnosti Hlídače, protože by kvůli tomu musela přijít o své jméno. Postupně se zaplétá do událostí, které mohou rozhodnout o osudu jejího národa i celého světa. Během příběhu poznává nové spojence i nepřátele a začíná chápat, co skutečně znamená být hrdinou.</w:t>
+      </w:r>
+    </w:p>
+    <w:p>
+      <w:r>
+        <w:rPr>
+          <w:b/>
+          <w:bCs/>
+        </w:rPr>
+        <w:t xml:space="preserve">Téma: </w:t>
+      </w:r>
+      <w:r>
+        <w:t>hledání vlastní identity</w:t>
+      </w:r>
+    </w:p>
+    <w:p>
+      <w:r>
+        <w:rPr>
+          <w:b/>
+          <w:bCs/>
+        </w:rPr>
+        <w:t>Motivy</w:t>
+      </w:r>
+      <w:r>
+        <w:rPr>
+          <w:b/>
+          <w:bCs/>
+        </w:rPr>
+        <w:t>:</w:t>
+      </w:r>
+      <w:r>
+        <w:t xml:space="preserve"> </w:t>
+      </w:r>
+      <w:r>
+        <w:t>magie, bohové, putování mezi světy, přátelství</w:t>
+      </w:r>
+    </w:p>
+    <w:p>
+      <w:r>
+        <w:rPr>
+          <w:b/>
+          <w:bCs/>
+        </w:rPr>
+        <w:t>Časoprostor</w:t>
+      </w:r>
+      <w:r>
+        <w:rPr>
+          <w:b/>
+          <w:bCs/>
+        </w:rPr>
+        <w:t xml:space="preserve">: </w:t>
+      </w:r>
+      <w:r>
+        <w:t>není určen</w:t>
+      </w:r>
+      <w:r>
+        <w:t xml:space="preserve"> (město </w:t>
+      </w:r>
+      <w:proofErr w:type="spellStart"/>
+      <w:r>
+        <w:t>N</w:t>
+      </w:r>
+      <w:r>
+        <w:t>urheim</w:t>
+      </w:r>
+      <w:proofErr w:type="spellEnd"/>
+      <w:r>
+        <w:t>)</w:t>
+      </w:r>
+    </w:p>
+    <w:p>
+      <w:r>
+        <w:rPr>
+          <w:b/>
+          <w:bCs/>
+        </w:rPr>
+        <w:t>Kompozice</w:t>
+      </w:r>
+      <w:r>
+        <w:t xml:space="preserve">: </w:t>
+      </w:r>
+      <w:r>
+        <w:t>chronologicky</w:t>
+      </w:r>
+    </w:p>
+    <w:p>
+      <w:r>
+        <w:rPr>
+          <w:b/>
+          <w:bCs/>
+        </w:rPr>
+        <w:t>Lit. Druh a žánr</w:t>
+      </w:r>
+      <w:r>
+        <w:t xml:space="preserve">: </w:t>
+      </w:r>
+      <w:r>
+        <w:t>Epika, fantasy román</w:t>
+      </w:r>
+    </w:p>
+    <w:p>
+      <w:pPr>
+        <w:rPr>
+          <w:b/>
+          <w:bCs/>
+          <w:sz w:val="24"/>
+          <w:szCs w:val="24"/>
+          <w:u w:val="single"/>
+        </w:rPr>
+      </w:pPr>
+      <w:r>
+        <w:rPr>
+          <w:b/>
+          <w:bCs/>
+          <w:sz w:val="24"/>
+          <w:szCs w:val="24"/>
+          <w:u w:val="single"/>
+        </w:rPr>
+        <w:t xml:space="preserve">2. část </w:t>
+      </w:r>
+    </w:p>
+    <w:p>
+      <w:pPr>
+        <w:rPr>
+          <w:b/>
+          <w:bCs/>
+        </w:rPr>
+      </w:pPr>
+      <w:r>
+        <w:rPr>
+          <w:b/>
+          <w:bCs/>
+        </w:rPr>
+        <w:t>Postavy</w:t>
+      </w:r>
+      <w:r>
+        <w:rPr>
+          <w:b/>
+          <w:bCs/>
+        </w:rPr>
+        <w:t xml:space="preserve">: </w:t>
+      </w:r>
+      <w:r>
+        <w:rPr>
+          <w:b/>
+          <w:bCs/>
+        </w:rPr>
+        <w:t xml:space="preserve"> </w:t>
+      </w:r>
+      <w:proofErr w:type="spellStart"/>
+      <w:r>
+        <w:rPr>
+          <w:b/>
+          <w:bCs/>
+        </w:rPr>
+        <w:t>Arila</w:t>
+      </w:r>
+      <w:proofErr w:type="spellEnd"/>
+      <w:r>
+        <w:rPr>
+          <w:b/>
+          <w:bCs/>
+        </w:rPr>
+        <w:t xml:space="preserve"> – </w:t>
+      </w:r>
+      <w:r>
+        <w:t>mladá léčitelka, odvážná, touží stát se hrdinkou, postupně dospívá</w:t>
+      </w:r>
+      <w:r>
+        <w:rPr>
+          <w:b/>
+          <w:bCs/>
+        </w:rPr>
+        <w:br/>
+      </w:r>
+      <w:r>
+        <w:rPr>
+          <w:b/>
+          <w:bCs/>
+        </w:rPr>
+        <w:t xml:space="preserve">                     </w:t>
+      </w:r>
+      <w:proofErr w:type="spellStart"/>
+      <w:r>
+        <w:rPr>
+          <w:b/>
+          <w:bCs/>
+        </w:rPr>
+        <w:t>Harari</w:t>
+      </w:r>
+      <w:proofErr w:type="spellEnd"/>
+      <w:r>
+        <w:rPr>
+          <w:b/>
+          <w:bCs/>
+        </w:rPr>
+        <w:t xml:space="preserve"> – </w:t>
+      </w:r>
+      <w:r>
+        <w:t>slepý Splétač, velmi inteligentní, zabývá se vědeckými pokusy</w:t>
+      </w:r>
+      <w:r>
+        <w:rPr>
+          <w:b/>
+          <w:bCs/>
+        </w:rPr>
+        <w:br/>
+      </w:r>
+      <w:r>
+        <w:rPr>
+          <w:b/>
+          <w:bCs/>
+        </w:rPr>
+        <w:t xml:space="preserve">                     </w:t>
+      </w:r>
+      <w:r>
+        <w:rPr>
+          <w:b/>
+          <w:bCs/>
+        </w:rPr>
+        <w:t xml:space="preserve">Vůdce – </w:t>
+      </w:r>
+      <w:r>
+        <w:t xml:space="preserve">vládce města </w:t>
+      </w:r>
+      <w:proofErr w:type="spellStart"/>
+      <w:r>
+        <w:t>Nurheim</w:t>
+      </w:r>
+      <w:proofErr w:type="spellEnd"/>
+      <w:r>
+        <w:t>, zastává ideologii „vyššího dobra“</w:t>
+      </w:r>
+      <w:r>
+        <w:rPr>
+          <w:b/>
+          <w:bCs/>
+        </w:rPr>
+        <w:br/>
+      </w:r>
+      <w:r>
+        <w:rPr>
+          <w:b/>
+          <w:bCs/>
+        </w:rPr>
+        <w:t xml:space="preserve">                     </w:t>
+      </w:r>
+      <w:proofErr w:type="spellStart"/>
+      <w:r>
+        <w:rPr>
+          <w:b/>
+          <w:bCs/>
+        </w:rPr>
+        <w:t>Dalaro</w:t>
+      </w:r>
+      <w:proofErr w:type="spellEnd"/>
+      <w:r>
+        <w:rPr>
+          <w:b/>
+          <w:bCs/>
+        </w:rPr>
+        <w:t xml:space="preserve"> – </w:t>
+      </w:r>
+      <w:r>
+        <w:t>bývalý bojovník</w:t>
+      </w:r>
+      <w:r>
+        <w:t>/hrdina</w:t>
+      </w:r>
+      <w:r>
+        <w:t>, nyní žoldák</w:t>
+      </w:r>
+      <w:r>
+        <w:rPr>
+          <w:b/>
+          <w:bCs/>
+        </w:rPr>
+        <w:br/>
+      </w:r>
+      <w:r>
+        <w:rPr>
+          <w:b/>
+          <w:bCs/>
+        </w:rPr>
+        <w:t xml:space="preserve">                     </w:t>
+      </w:r>
+      <w:proofErr w:type="spellStart"/>
+      <w:r>
+        <w:rPr>
+          <w:b/>
+          <w:bCs/>
+        </w:rPr>
+        <w:t>Tormi</w:t>
+      </w:r>
+      <w:proofErr w:type="spellEnd"/>
+      <w:r>
+        <w:rPr>
+          <w:b/>
+          <w:bCs/>
+        </w:rPr>
+        <w:t xml:space="preserve"> – </w:t>
+      </w:r>
+      <w:r>
+        <w:t>bojovník a adept na Hlídače</w:t>
+      </w:r>
+    </w:p>
+    <w:p>
+      <w:pPr>
+        <w:rPr>
+          <w:b/>
+          <w:bCs/>
+          <w:sz w:val="24"/>
+          <w:szCs w:val="24"/>
+          <w:u w:val="single"/>
+        </w:rPr>
+      </w:pPr>
+      <w:r>
+        <w:rPr>
+          <w:b/>
+          <w:bCs/>
+          <w:sz w:val="24"/>
+          <w:szCs w:val="24"/>
+          <w:u w:val="single"/>
+        </w:rPr>
+        <w:t>3.část</w:t>
+      </w:r>
+      <w:r>
+        <w:rPr>
+          <w:b/>
+          <w:bCs/>
+          <w:sz w:val="24"/>
+          <w:szCs w:val="24"/>
+          <w:u w:val="single"/>
+        </w:rPr>
+        <w:t xml:space="preserve"> </w:t>
+      </w:r>
+    </w:p>
+    <w:p>
+      <w:r>
+        <w:rPr>
+          <w:b/>
+          <w:bCs/>
+        </w:rPr>
+        <w:t>Další autorova díla:</w:t>
+      </w:r>
+      <w:r>
+        <w:rPr>
+          <w:b/>
+          <w:bCs/>
+        </w:rPr>
+        <w:t xml:space="preserve"> </w:t>
+      </w:r>
+      <w:proofErr w:type="spellStart"/>
+      <w:r>
+        <w:t>Arila</w:t>
+      </w:r>
+      <w:proofErr w:type="spellEnd"/>
+      <w:r>
+        <w:t xml:space="preserve"> poslední hvězda</w:t>
+      </w:r>
+    </w:p>
+    <w:p>
+      <w:r>
+        <w:rPr>
+          <w:b/>
+          <w:bCs/>
+        </w:rPr>
+        <w:t>Literárně/kulturní kontext</w:t>
+      </w:r>
+      <w:r>
+        <w:rPr>
+          <w:b/>
+          <w:bCs/>
+        </w:rPr>
+        <w:t xml:space="preserve">: </w:t>
+      </w:r>
+      <w:r>
+        <w:t>současná česká fantasy literatura (21. století), literatura pro mládež, podobná díla – Harry Potter (J. K. Rowlingová), Andrzej Sapkowski (Zaklínač</w:t>
+      </w:r>
+      <w:r>
+        <w:t>)</w:t>
       </w:r>
     </w:p>
     <w:p/>
@@ -7641,7 +9895,7 @@
   <w:style w:type="paragraph" w:default="1" w:styleId="Normln">
     <w:name w:val="Normal"/>
     <w:qFormat/>
-    <w:rsid w:val="00174D14"/>
+    <w:rsid w:val="00AC126F"/>
   </w:style>
   <w:style w:type="paragraph" w:styleId="Nadpis1">
     <w:name w:val="heading 1"/>
@@ -7845,7 +10099,6 @@
   <w:style w:type="character" w:default="1" w:styleId="Standardnpsmoodstavce">
     <w:name w:val="Default Paragraph Font"/>
     <w:uiPriority w:val="1"/>
-    <w:semiHidden/>
     <w:unhideWhenUsed/>
   </w:style>
   <w:style w:type="table" w:default="1" w:styleId="Normlntabulka">
@@ -8195,6 +10448,15 @@
       <w:shd w:val="clear" w:color="auto" w:fill="E1DFDD"/>
     </w:rPr>
   </w:style>
+  <w:style w:type="paragraph" w:styleId="Bezmezer">
+    <w:name w:val="No Spacing"/>
+    <w:uiPriority w:val="1"/>
+    <w:qFormat/>
+    <w:rsid w:val="007C23D4"/>
+    <w:pPr>
+      <w:spacing w:after="0" w:line="240" w:lineRule="auto"/>
+    </w:pPr>
+  </w:style>
 </w:styles>
 </file>
 

</xml_diff>